<commit_message>
Commit miércoles 14 de octubre.
</commit_message>
<xml_diff>
--- a/PMDM/Temario/UT2/UT2_PMDM_Apuntes_Parte1_Kotlin.docx
+++ b/PMDM/Temario/UT2/UT2_PMDM_Apuntes_Parte1_Kotlin.docx
@@ -2263,9 +2263,9 @@
         </w:tblCellMar>
       </w:tblPr>
       <w:tblGrid>
-        <w:gridCol w:w="1211"/>
+        <w:gridCol w:w="1210"/>
         <w:gridCol w:w="4544"/>
-        <w:gridCol w:w="3031"/>
+        <w:gridCol w:w="3032"/>
       </w:tblGrid>
       <w:tr>
         <w:trPr>
@@ -2274,7 +2274,7 @@
         </w:trPr>
         <w:tc>
           <w:tcPr>
-            <w:tcW w:w="1211" w:type="dxa"/>
+            <w:tcW w:w="1210" w:type="dxa"/>
             <w:tcBorders>
               <w:top w:val="single" w:sz="4" w:space="0" w:color="BFBFBF"/>
               <w:start w:val="single" w:sz="4" w:space="0" w:color="BFBFBF"/>
@@ -2330,7 +2330,7 @@
         </w:tc>
         <w:tc>
           <w:tcPr>
-            <w:tcW w:w="3031" w:type="dxa"/>
+            <w:tcW w:w="3032" w:type="dxa"/>
             <w:tcBorders>
               <w:top w:val="single" w:sz="4" w:space="0" w:color="BFBFBF"/>
               <w:start w:val="single" w:sz="4" w:space="0" w:color="BFBFBF"/>
@@ -2363,7 +2363,7 @@
         </w:trPr>
         <w:tc>
           <w:tcPr>
-            <w:tcW w:w="1211" w:type="dxa"/>
+            <w:tcW w:w="1210" w:type="dxa"/>
             <w:tcBorders>
               <w:top w:val="single" w:sz="4" w:space="0" w:color="BFBFBF"/>
               <w:start w:val="single" w:sz="4" w:space="0" w:color="BFBFBF"/>
@@ -2415,7 +2415,7 @@
         </w:tc>
         <w:tc>
           <w:tcPr>
-            <w:tcW w:w="3031" w:type="dxa"/>
+            <w:tcW w:w="3032" w:type="dxa"/>
             <w:tcBorders>
               <w:top w:val="single" w:sz="4" w:space="0" w:color="BFBFBF"/>
               <w:start w:val="single" w:sz="4" w:space="0" w:color="BFBFBF"/>
@@ -2446,7 +2446,7 @@
         </w:trPr>
         <w:tc>
           <w:tcPr>
-            <w:tcW w:w="1211" w:type="dxa"/>
+            <w:tcW w:w="1210" w:type="dxa"/>
             <w:tcBorders>
               <w:top w:val="single" w:sz="4" w:space="0" w:color="BFBFBF"/>
               <w:start w:val="single" w:sz="4" w:space="0" w:color="BFBFBF"/>
@@ -2500,7 +2500,7 @@
         </w:tc>
         <w:tc>
           <w:tcPr>
-            <w:tcW w:w="3031" w:type="dxa"/>
+            <w:tcW w:w="3032" w:type="dxa"/>
             <w:tcBorders>
               <w:top w:val="single" w:sz="4" w:space="0" w:color="BFBFBF"/>
               <w:start w:val="single" w:sz="4" w:space="0" w:color="BFBFBF"/>
@@ -2615,7 +2615,11 @@
               </w:rPr>
             </w:pPr>
             <w:r>
-              <w:rPr/>
+              <w:rPr>
+                <w:rFonts w:cs="Consolas" w:ascii="Consolas" w:hAnsi="Consolas"/>
+                <w:color w:val="1B1B1B"/>
+                <w:sz w:val="16"/>
+              </w:rPr>
             </w:r>
           </w:p>
           <w:p>
@@ -2915,7 +2919,11 @@
               </w:rPr>
             </w:pPr>
             <w:r>
-              <w:rPr/>
+              <w:rPr>
+                <w:rFonts w:cs="Consolas" w:ascii="Consolas" w:hAnsi="Consolas"/>
+                <w:color w:val="1B1B1B"/>
+                <w:sz w:val="16"/>
+              </w:rPr>
             </w:r>
           </w:p>
           <w:p>
@@ -2978,9 +2986,9 @@
         </w:tblCellMar>
       </w:tblPr>
       <w:tblGrid>
-        <w:gridCol w:w="1695"/>
+        <w:gridCol w:w="1694"/>
         <w:gridCol w:w="4624"/>
-        <w:gridCol w:w="2467"/>
+        <w:gridCol w:w="2468"/>
       </w:tblGrid>
       <w:tr>
         <w:trPr>
@@ -2989,7 +2997,7 @@
         </w:trPr>
         <w:tc>
           <w:tcPr>
-            <w:tcW w:w="1695" w:type="dxa"/>
+            <w:tcW w:w="1694" w:type="dxa"/>
             <w:tcBorders>
               <w:top w:val="single" w:sz="4" w:space="0" w:color="BFBFBF"/>
               <w:start w:val="single" w:sz="4" w:space="0" w:color="BFBFBF"/>
@@ -3045,7 +3053,7 @@
         </w:tc>
         <w:tc>
           <w:tcPr>
-            <w:tcW w:w="2467" w:type="dxa"/>
+            <w:tcW w:w="2468" w:type="dxa"/>
             <w:tcBorders>
               <w:top w:val="single" w:sz="4" w:space="0" w:color="BFBFBF"/>
               <w:start w:val="single" w:sz="4" w:space="0" w:color="BFBFBF"/>
@@ -3078,7 +3086,7 @@
         </w:trPr>
         <w:tc>
           <w:tcPr>
-            <w:tcW w:w="1695" w:type="dxa"/>
+            <w:tcW w:w="1694" w:type="dxa"/>
             <w:tcBorders>
               <w:top w:val="single" w:sz="4" w:space="0" w:color="BFBFBF"/>
               <w:start w:val="single" w:sz="4" w:space="0" w:color="BFBFBF"/>
@@ -3130,7 +3138,7 @@
         </w:tc>
         <w:tc>
           <w:tcPr>
-            <w:tcW w:w="2467" w:type="dxa"/>
+            <w:tcW w:w="2468" w:type="dxa"/>
             <w:tcBorders>
               <w:top w:val="single" w:sz="4" w:space="0" w:color="BFBFBF"/>
               <w:start w:val="single" w:sz="4" w:space="0" w:color="BFBFBF"/>
@@ -3161,7 +3169,7 @@
         </w:trPr>
         <w:tc>
           <w:tcPr>
-            <w:tcW w:w="1695" w:type="dxa"/>
+            <w:tcW w:w="1694" w:type="dxa"/>
             <w:tcBorders>
               <w:top w:val="single" w:sz="4" w:space="0" w:color="BFBFBF"/>
               <w:start w:val="single" w:sz="4" w:space="0" w:color="BFBFBF"/>
@@ -3215,7 +3223,7 @@
         </w:tc>
         <w:tc>
           <w:tcPr>
-            <w:tcW w:w="2467" w:type="dxa"/>
+            <w:tcW w:w="2468" w:type="dxa"/>
             <w:tcBorders>
               <w:top w:val="single" w:sz="4" w:space="0" w:color="BFBFBF"/>
               <w:start w:val="single" w:sz="4" w:space="0" w:color="BFBFBF"/>
@@ -3247,7 +3255,7 @@
         </w:trPr>
         <w:tc>
           <w:tcPr>
-            <w:tcW w:w="1695" w:type="dxa"/>
+            <w:tcW w:w="1694" w:type="dxa"/>
             <w:tcBorders>
               <w:top w:val="single" w:sz="4" w:space="0" w:color="BFBFBF"/>
               <w:start w:val="single" w:sz="4" w:space="0" w:color="BFBFBF"/>
@@ -3299,7 +3307,7 @@
         </w:tc>
         <w:tc>
           <w:tcPr>
-            <w:tcW w:w="2467" w:type="dxa"/>
+            <w:tcW w:w="2468" w:type="dxa"/>
             <w:tcBorders>
               <w:top w:val="single" w:sz="4" w:space="0" w:color="BFBFBF"/>
               <w:start w:val="single" w:sz="4" w:space="0" w:color="BFBFBF"/>
@@ -3330,7 +3338,7 @@
         </w:trPr>
         <w:tc>
           <w:tcPr>
-            <w:tcW w:w="1695" w:type="dxa"/>
+            <w:tcW w:w="1694" w:type="dxa"/>
             <w:tcBorders>
               <w:top w:val="single" w:sz="4" w:space="0" w:color="BFBFBF"/>
               <w:start w:val="single" w:sz="4" w:space="0" w:color="BFBFBF"/>
@@ -3384,7 +3392,7 @@
         </w:tc>
         <w:tc>
           <w:tcPr>
-            <w:tcW w:w="2467" w:type="dxa"/>
+            <w:tcW w:w="2468" w:type="dxa"/>
             <w:tcBorders>
               <w:top w:val="single" w:sz="4" w:space="0" w:color="BFBFBF"/>
               <w:start w:val="single" w:sz="4" w:space="0" w:color="BFBFBF"/>
@@ -3416,7 +3424,7 @@
         </w:trPr>
         <w:tc>
           <w:tcPr>
-            <w:tcW w:w="1695" w:type="dxa"/>
+            <w:tcW w:w="1694" w:type="dxa"/>
             <w:tcBorders>
               <w:top w:val="single" w:sz="4" w:space="0" w:color="BFBFBF"/>
               <w:start w:val="single" w:sz="4" w:space="0" w:color="BFBFBF"/>
@@ -3468,7 +3476,7 @@
         </w:tc>
         <w:tc>
           <w:tcPr>
-            <w:tcW w:w="2467" w:type="dxa"/>
+            <w:tcW w:w="2468" w:type="dxa"/>
             <w:tcBorders>
               <w:top w:val="single" w:sz="4" w:space="0" w:color="BFBFBF"/>
               <w:start w:val="single" w:sz="4" w:space="0" w:color="BFBFBF"/>
@@ -3499,7 +3507,7 @@
         </w:trPr>
         <w:tc>
           <w:tcPr>
-            <w:tcW w:w="1695" w:type="dxa"/>
+            <w:tcW w:w="1694" w:type="dxa"/>
             <w:tcBorders>
               <w:top w:val="single" w:sz="4" w:space="0" w:color="BFBFBF"/>
               <w:start w:val="single" w:sz="4" w:space="0" w:color="BFBFBF"/>
@@ -3553,7 +3561,7 @@
         </w:tc>
         <w:tc>
           <w:tcPr>
-            <w:tcW w:w="2467" w:type="dxa"/>
+            <w:tcW w:w="2468" w:type="dxa"/>
             <w:tcBorders>
               <w:top w:val="single" w:sz="4" w:space="0" w:color="BFBFBF"/>
               <w:start w:val="single" w:sz="4" w:space="0" w:color="BFBFBF"/>
@@ -3585,7 +3593,7 @@
         </w:trPr>
         <w:tc>
           <w:tcPr>
-            <w:tcW w:w="1695" w:type="dxa"/>
+            <w:tcW w:w="1694" w:type="dxa"/>
             <w:tcBorders>
               <w:top w:val="single" w:sz="4" w:space="0" w:color="BFBFBF"/>
               <w:start w:val="single" w:sz="4" w:space="0" w:color="BFBFBF"/>
@@ -3637,7 +3645,7 @@
         </w:tc>
         <w:tc>
           <w:tcPr>
-            <w:tcW w:w="2467" w:type="dxa"/>
+            <w:tcW w:w="2468" w:type="dxa"/>
             <w:tcBorders>
               <w:top w:val="single" w:sz="4" w:space="0" w:color="BFBFBF"/>
               <w:start w:val="single" w:sz="4" w:space="0" w:color="BFBFBF"/>
@@ -3668,7 +3676,7 @@
         </w:trPr>
         <w:tc>
           <w:tcPr>
-            <w:tcW w:w="1695" w:type="dxa"/>
+            <w:tcW w:w="1694" w:type="dxa"/>
             <w:tcBorders>
               <w:top w:val="single" w:sz="4" w:space="0" w:color="BFBFBF"/>
               <w:start w:val="single" w:sz="4" w:space="0" w:color="BFBFBF"/>
@@ -3722,7 +3730,7 @@
         </w:tc>
         <w:tc>
           <w:tcPr>
-            <w:tcW w:w="2467" w:type="dxa"/>
+            <w:tcW w:w="2468" w:type="dxa"/>
             <w:tcBorders>
               <w:top w:val="single" w:sz="4" w:space="0" w:color="BFBFBF"/>
               <w:start w:val="single" w:sz="4" w:space="0" w:color="BFBFBF"/>
@@ -3999,7 +4007,11 @@
               </w:rPr>
             </w:pPr>
             <w:r>
-              <w:rPr/>
+              <w:rPr>
+                <w:rFonts w:cs="Consolas" w:ascii="Consolas" w:hAnsi="Consolas"/>
+                <w:color w:val="1B1B1B"/>
+                <w:sz w:val="16"/>
+              </w:rPr>
             </w:r>
           </w:p>
           <w:p>
@@ -5183,7 +5195,11 @@
               </w:rPr>
             </w:pPr>
             <w:r>
-              <w:rPr/>
+              <w:rPr>
+                <w:rFonts w:cs="Consolas" w:ascii="Consolas" w:hAnsi="Consolas"/>
+                <w:color w:val="1B1B1B"/>
+                <w:sz w:val="16"/>
+              </w:rPr>
             </w:r>
           </w:p>
           <w:p>
@@ -5324,7 +5340,11 @@
               </w:rPr>
             </w:pPr>
             <w:r>
-              <w:rPr/>
+              <w:rPr>
+                <w:rFonts w:cs="Consolas" w:ascii="Consolas" w:hAnsi="Consolas"/>
+                <w:color w:val="1B1B1B"/>
+                <w:sz w:val="16"/>
+              </w:rPr>
             </w:r>
           </w:p>
           <w:p>
@@ -6880,8 +6900,8 @@
         </w:tblCellMar>
       </w:tblPr>
       <w:tblGrid>
-        <w:gridCol w:w="2049"/>
-        <w:gridCol w:w="2344"/>
+        <w:gridCol w:w="2048"/>
+        <w:gridCol w:w="2345"/>
         <w:gridCol w:w="4393"/>
       </w:tblGrid>
       <w:tr>
@@ -6891,7 +6911,7 @@
         </w:trPr>
         <w:tc>
           <w:tcPr>
-            <w:tcW w:w="2049" w:type="dxa"/>
+            <w:tcW w:w="2048" w:type="dxa"/>
             <w:tcBorders>
               <w:top w:val="single" w:sz="4" w:space="0" w:color="BFBFBF"/>
               <w:start w:val="single" w:sz="4" w:space="0" w:color="BFBFBF"/>
@@ -6919,7 +6939,7 @@
         </w:tc>
         <w:tc>
           <w:tcPr>
-            <w:tcW w:w="2344" w:type="dxa"/>
+            <w:tcW w:w="2345" w:type="dxa"/>
             <w:tcBorders>
               <w:top w:val="single" w:sz="4" w:space="0" w:color="BFBFBF"/>
               <w:start w:val="single" w:sz="4" w:space="0" w:color="BFBFBF"/>
@@ -6980,7 +7000,7 @@
         </w:trPr>
         <w:tc>
           <w:tcPr>
-            <w:tcW w:w="2049" w:type="dxa"/>
+            <w:tcW w:w="2048" w:type="dxa"/>
             <w:tcBorders>
               <w:top w:val="single" w:sz="4" w:space="0" w:color="BFBFBF"/>
               <w:start w:val="single" w:sz="4" w:space="0" w:color="BFBFBF"/>
@@ -7008,7 +7028,7 @@
         </w:tc>
         <w:tc>
           <w:tcPr>
-            <w:tcW w:w="2344" w:type="dxa"/>
+            <w:tcW w:w="2345" w:type="dxa"/>
             <w:tcBorders>
               <w:top w:val="single" w:sz="4" w:space="0" w:color="BFBFBF"/>
               <w:start w:val="single" w:sz="4" w:space="0" w:color="BFBFBF"/>
@@ -7065,7 +7085,7 @@
         </w:trPr>
         <w:tc>
           <w:tcPr>
-            <w:tcW w:w="2049" w:type="dxa"/>
+            <w:tcW w:w="2048" w:type="dxa"/>
             <w:tcBorders>
               <w:top w:val="single" w:sz="4" w:space="0" w:color="BFBFBF"/>
               <w:start w:val="single" w:sz="4" w:space="0" w:color="BFBFBF"/>
@@ -7094,7 +7114,7 @@
         </w:tc>
         <w:tc>
           <w:tcPr>
-            <w:tcW w:w="2344" w:type="dxa"/>
+            <w:tcW w:w="2345" w:type="dxa"/>
             <w:tcBorders>
               <w:top w:val="single" w:sz="4" w:space="0" w:color="BFBFBF"/>
               <w:start w:val="single" w:sz="4" w:space="0" w:color="BFBFBF"/>
@@ -7153,7 +7173,7 @@
         </w:trPr>
         <w:tc>
           <w:tcPr>
-            <w:tcW w:w="2049" w:type="dxa"/>
+            <w:tcW w:w="2048" w:type="dxa"/>
             <w:tcBorders>
               <w:top w:val="single" w:sz="4" w:space="0" w:color="BFBFBF"/>
               <w:start w:val="single" w:sz="4" w:space="0" w:color="BFBFBF"/>
@@ -7181,7 +7201,7 @@
         </w:tc>
         <w:tc>
           <w:tcPr>
-            <w:tcW w:w="2344" w:type="dxa"/>
+            <w:tcW w:w="2345" w:type="dxa"/>
             <w:tcBorders>
               <w:top w:val="single" w:sz="4" w:space="0" w:color="BFBFBF"/>
               <w:start w:val="single" w:sz="4" w:space="0" w:color="BFBFBF"/>
@@ -7238,7 +7258,7 @@
         </w:trPr>
         <w:tc>
           <w:tcPr>
-            <w:tcW w:w="2049" w:type="dxa"/>
+            <w:tcW w:w="2048" w:type="dxa"/>
             <w:tcBorders>
               <w:top w:val="single" w:sz="4" w:space="0" w:color="BFBFBF"/>
               <w:start w:val="single" w:sz="4" w:space="0" w:color="BFBFBF"/>
@@ -7267,7 +7287,7 @@
         </w:tc>
         <w:tc>
           <w:tcPr>
-            <w:tcW w:w="2344" w:type="dxa"/>
+            <w:tcW w:w="2345" w:type="dxa"/>
             <w:tcBorders>
               <w:top w:val="single" w:sz="4" w:space="0" w:color="BFBFBF"/>
               <w:start w:val="single" w:sz="4" w:space="0" w:color="BFBFBF"/>
@@ -7326,7 +7346,7 @@
         </w:trPr>
         <w:tc>
           <w:tcPr>
-            <w:tcW w:w="2049" w:type="dxa"/>
+            <w:tcW w:w="2048" w:type="dxa"/>
             <w:tcBorders>
               <w:top w:val="single" w:sz="4" w:space="0" w:color="BFBFBF"/>
               <w:start w:val="single" w:sz="4" w:space="0" w:color="BFBFBF"/>
@@ -7354,7 +7374,7 @@
         </w:tc>
         <w:tc>
           <w:tcPr>
-            <w:tcW w:w="2344" w:type="dxa"/>
+            <w:tcW w:w="2345" w:type="dxa"/>
             <w:tcBorders>
               <w:top w:val="single" w:sz="4" w:space="0" w:color="BFBFBF"/>
               <w:start w:val="single" w:sz="4" w:space="0" w:color="BFBFBF"/>
@@ -7979,7 +7999,11 @@
               </w:rPr>
             </w:pPr>
             <w:r>
-              <w:rPr/>
+              <w:rPr>
+                <w:rFonts w:cs="Consolas" w:ascii="Consolas" w:hAnsi="Consolas"/>
+                <w:color w:val="1B1B1B"/>
+                <w:sz w:val="16"/>
+              </w:rPr>
             </w:r>
           </w:p>
           <w:p>
@@ -8071,7 +8095,11 @@
               </w:rPr>
             </w:pPr>
             <w:r>
-              <w:rPr/>
+              <w:rPr>
+                <w:rFonts w:cs="Consolas" w:ascii="Consolas" w:hAnsi="Consolas"/>
+                <w:color w:val="1B1B1B"/>
+                <w:sz w:val="16"/>
+              </w:rPr>
             </w:r>
           </w:p>
           <w:p>
@@ -8568,7 +8596,11 @@
               </w:rPr>
             </w:pPr>
             <w:r>
-              <w:rPr/>
+              <w:rPr>
+                <w:rFonts w:cs="Consolas" w:ascii="Consolas" w:hAnsi="Consolas"/>
+                <w:color w:val="1B1B1B"/>
+                <w:sz w:val="16"/>
+              </w:rPr>
             </w:r>
           </w:p>
           <w:p>
@@ -8759,7 +8791,11 @@
               </w:rPr>
             </w:pPr>
             <w:r>
-              <w:rPr/>
+              <w:rPr>
+                <w:rFonts w:cs="Consolas" w:ascii="Consolas" w:hAnsi="Consolas"/>
+                <w:color w:val="1B1B1B"/>
+                <w:sz w:val="16"/>
+              </w:rPr>
             </w:r>
           </w:p>
           <w:p>
@@ -9143,7 +9179,11 @@
               </w:rPr>
             </w:pPr>
             <w:r>
-              <w:rPr/>
+              <w:rPr>
+                <w:rFonts w:cs="Consolas" w:ascii="Consolas" w:hAnsi="Consolas"/>
+                <w:color w:val="1B1B1B"/>
+                <w:sz w:val="15"/>
+              </w:rPr>
             </w:r>
           </w:p>
           <w:p>
@@ -9297,7 +9337,11 @@
               </w:rPr>
             </w:pPr>
             <w:r>
-              <w:rPr/>
+              <w:rPr>
+                <w:rFonts w:cs="Consolas" w:ascii="Consolas" w:hAnsi="Consolas"/>
+                <w:color w:val="1B1B1B"/>
+                <w:sz w:val="15"/>
+              </w:rPr>
             </w:r>
           </w:p>
           <w:p>
@@ -9551,7 +9595,11 @@
               </w:rPr>
             </w:pPr>
             <w:r>
-              <w:rPr/>
+              <w:rPr>
+                <w:rFonts w:cs="Consolas" w:ascii="Consolas" w:hAnsi="Consolas"/>
+                <w:color w:val="1B1B1B"/>
+                <w:sz w:val="16"/>
+              </w:rPr>
             </w:r>
           </w:p>
           <w:p>
@@ -9584,7 +9632,11 @@
               </w:rPr>
             </w:pPr>
             <w:r>
-              <w:rPr/>
+              <w:rPr>
+                <w:rFonts w:cs="Consolas" w:ascii="Consolas" w:hAnsi="Consolas"/>
+                <w:color w:val="1B1B1B"/>
+                <w:sz w:val="16"/>
+              </w:rPr>
             </w:r>
           </w:p>
           <w:p>
@@ -9842,7 +9894,11 @@
               </w:rPr>
             </w:pPr>
             <w:r>
-              <w:rPr/>
+              <w:rPr>
+                <w:rFonts w:cs="Consolas" w:ascii="Consolas" w:hAnsi="Consolas"/>
+                <w:color w:val="1B1B1B"/>
+                <w:sz w:val="16"/>
+              </w:rPr>
             </w:r>
           </w:p>
           <w:p>
@@ -10255,7 +10311,11 @@
               </w:rPr>
             </w:pPr>
             <w:r>
-              <w:rPr/>
+              <w:rPr>
+                <w:rFonts w:cs="Consolas" w:ascii="Consolas" w:hAnsi="Consolas"/>
+                <w:color w:val="1B1B1B"/>
+                <w:sz w:val="16"/>
+              </w:rPr>
             </w:r>
           </w:p>
           <w:p>
@@ -10507,7 +10567,11 @@
               </w:rPr>
             </w:pPr>
             <w:r>
-              <w:rPr/>
+              <w:rPr>
+                <w:rFonts w:cs="Consolas" w:ascii="Consolas" w:hAnsi="Consolas"/>
+                <w:color w:val="1B1B1B"/>
+                <w:sz w:val="16"/>
+              </w:rPr>
             </w:r>
           </w:p>
           <w:p>
@@ -10540,7 +10604,11 @@
               </w:rPr>
             </w:pPr>
             <w:r>
-              <w:rPr/>
+              <w:rPr>
+                <w:rFonts w:cs="Consolas" w:ascii="Consolas" w:hAnsi="Consolas"/>
+                <w:color w:val="1B1B1B"/>
+                <w:sz w:val="16"/>
+              </w:rPr>
             </w:r>
           </w:p>
           <w:p>
@@ -11012,7 +11080,11 @@
               </w:rPr>
             </w:pPr>
             <w:r>
-              <w:rPr/>
+              <w:rPr>
+                <w:rFonts w:cs="Consolas" w:ascii="Consolas" w:hAnsi="Consolas"/>
+                <w:color w:val="1B1B1B"/>
+                <w:sz w:val="16"/>
+              </w:rPr>
             </w:r>
           </w:p>
           <w:p>
@@ -11043,7 +11115,11 @@
               </w:rPr>
             </w:pPr>
             <w:r>
-              <w:rPr/>
+              <w:rPr>
+                <w:rFonts w:cs="Consolas" w:ascii="Consolas" w:hAnsi="Consolas"/>
+                <w:color w:val="1B1B1B"/>
+                <w:sz w:val="16"/>
+              </w:rPr>
             </w:r>
           </w:p>
           <w:p>
@@ -11074,7 +11150,11 @@
               </w:rPr>
             </w:pPr>
             <w:r>
-              <w:rPr/>
+              <w:rPr>
+                <w:rFonts w:cs="Consolas" w:ascii="Consolas" w:hAnsi="Consolas"/>
+                <w:color w:val="1B1B1B"/>
+                <w:sz w:val="16"/>
+              </w:rPr>
             </w:r>
           </w:p>
           <w:p>
@@ -11105,7 +11185,11 @@
               </w:rPr>
             </w:pPr>
             <w:r>
-              <w:rPr/>
+              <w:rPr>
+                <w:rFonts w:cs="Consolas" w:ascii="Consolas" w:hAnsi="Consolas"/>
+                <w:color w:val="1B1B1B"/>
+                <w:sz w:val="16"/>
+              </w:rPr>
             </w:r>
           </w:p>
           <w:p>
@@ -11136,7 +11220,11 @@
               </w:rPr>
             </w:pPr>
             <w:r>
-              <w:rPr/>
+              <w:rPr>
+                <w:rFonts w:cs="Consolas" w:ascii="Consolas" w:hAnsi="Consolas"/>
+                <w:color w:val="1B1B1B"/>
+                <w:sz w:val="16"/>
+              </w:rPr>
             </w:r>
           </w:p>
           <w:p>
@@ -11167,7 +11255,11 @@
               </w:rPr>
             </w:pPr>
             <w:r>
-              <w:rPr/>
+              <w:rPr>
+                <w:rFonts w:cs="Consolas" w:ascii="Consolas" w:hAnsi="Consolas"/>
+                <w:color w:val="1B1B1B"/>
+                <w:sz w:val="16"/>
+              </w:rPr>
             </w:r>
           </w:p>
           <w:p>
@@ -11734,7 +11826,11 @@
               </w:rPr>
             </w:pPr>
             <w:r>
-              <w:rPr/>
+              <w:rPr>
+                <w:rFonts w:cs="Consolas" w:ascii="Consolas" w:hAnsi="Consolas"/>
+                <w:color w:val="1B1B1B"/>
+                <w:sz w:val="16"/>
+              </w:rPr>
             </w:r>
           </w:p>
           <w:p>
@@ -12179,7 +12275,11 @@
               </w:rPr>
             </w:pPr>
             <w:r>
-              <w:rPr/>
+              <w:rPr>
+                <w:rFonts w:cs="Consolas" w:ascii="Consolas" w:hAnsi="Consolas"/>
+                <w:color w:val="1B1B1B"/>
+                <w:sz w:val="16"/>
+              </w:rPr>
             </w:r>
           </w:p>
           <w:p>
@@ -12229,7 +12329,11 @@
               </w:rPr>
             </w:pPr>
             <w:r>
-              <w:rPr/>
+              <w:rPr>
+                <w:rFonts w:cs="Consolas" w:ascii="Consolas" w:hAnsi="Consolas"/>
+                <w:color w:val="1B1B1B"/>
+                <w:sz w:val="16"/>
+              </w:rPr>
             </w:r>
           </w:p>
           <w:p>
@@ -13043,7 +13147,11 @@
               </w:rPr>
             </w:pPr>
             <w:r>
-              <w:rPr/>
+              <w:rPr>
+                <w:rFonts w:cs="Consolas" w:ascii="Consolas" w:hAnsi="Consolas"/>
+                <w:color w:val="1B1B1B"/>
+                <w:sz w:val="16"/>
+              </w:rPr>
             </w:r>
           </w:p>
           <w:p>
@@ -13159,7 +13267,11 @@
               </w:rPr>
             </w:pPr>
             <w:r>
-              <w:rPr/>
+              <w:rPr>
+                <w:rFonts w:cs="Consolas" w:ascii="Consolas" w:hAnsi="Consolas"/>
+                <w:color w:val="1B1B1B"/>
+                <w:sz w:val="16"/>
+              </w:rPr>
             </w:r>
           </w:p>
           <w:p>
@@ -13250,7 +13362,11 @@
               </w:rPr>
             </w:pPr>
             <w:r>
-              <w:rPr/>
+              <w:rPr>
+                <w:rFonts w:cs="Consolas" w:ascii="Consolas" w:hAnsi="Consolas"/>
+                <w:color w:val="1B1B1B"/>
+                <w:sz w:val="16"/>
+              </w:rPr>
             </w:r>
           </w:p>
           <w:p>
@@ -13341,7 +13457,11 @@
               </w:rPr>
             </w:pPr>
             <w:r>
-              <w:rPr/>
+              <w:rPr>
+                <w:rFonts w:cs="Consolas" w:ascii="Consolas" w:hAnsi="Consolas"/>
+                <w:color w:val="1B1B1B"/>
+                <w:sz w:val="16"/>
+              </w:rPr>
             </w:r>
           </w:p>
           <w:p>
@@ -13407,7 +13527,11 @@
               </w:rPr>
             </w:pPr>
             <w:r>
-              <w:rPr/>
+              <w:rPr>
+                <w:rFonts w:cs="Consolas" w:ascii="Consolas" w:hAnsi="Consolas"/>
+                <w:color w:val="1B1B1B"/>
+                <w:sz w:val="16"/>
+              </w:rPr>
             </w:r>
           </w:p>
           <w:p>
@@ -14091,7 +14215,11 @@
               </w:rPr>
             </w:pPr>
             <w:r>
-              <w:rPr/>
+              <w:rPr>
+                <w:rFonts w:cs="Consolas" w:ascii="Consolas" w:hAnsi="Consolas"/>
+                <w:color w:val="1B1B1B"/>
+                <w:sz w:val="16"/>
+              </w:rPr>
             </w:r>
           </w:p>
           <w:p>
@@ -14124,7 +14252,11 @@
               </w:rPr>
             </w:pPr>
             <w:r>
-              <w:rPr/>
+              <w:rPr>
+                <w:rFonts w:cs="Consolas" w:ascii="Consolas" w:hAnsi="Consolas"/>
+                <w:color w:val="1B1B1B"/>
+                <w:sz w:val="16"/>
+              </w:rPr>
             </w:r>
           </w:p>
           <w:p>
@@ -14157,7 +14289,11 @@
               </w:rPr>
             </w:pPr>
             <w:r>
-              <w:rPr/>
+              <w:rPr>
+                <w:rFonts w:cs="Consolas" w:ascii="Consolas" w:hAnsi="Consolas"/>
+                <w:color w:val="1B1B1B"/>
+                <w:sz w:val="16"/>
+              </w:rPr>
             </w:r>
           </w:p>
           <w:p>
@@ -14190,7 +14326,11 @@
               </w:rPr>
             </w:pPr>
             <w:r>
-              <w:rPr/>
+              <w:rPr>
+                <w:rFonts w:cs="Consolas" w:ascii="Consolas" w:hAnsi="Consolas"/>
+                <w:color w:val="1B1B1B"/>
+                <w:sz w:val="16"/>
+              </w:rPr>
             </w:r>
           </w:p>
           <w:p>
@@ -14223,7 +14363,11 @@
               </w:rPr>
             </w:pPr>
             <w:r>
-              <w:rPr/>
+              <w:rPr>
+                <w:rFonts w:cs="Consolas" w:ascii="Consolas" w:hAnsi="Consolas"/>
+                <w:color w:val="1B1B1B"/>
+                <w:sz w:val="16"/>
+              </w:rPr>
             </w:r>
           </w:p>
           <w:p>
@@ -14665,7 +14809,11 @@
               </w:rPr>
             </w:pPr>
             <w:r>
-              <w:rPr/>
+              <w:rPr>
+                <w:rFonts w:cs="Consolas" w:ascii="Consolas" w:hAnsi="Consolas"/>
+                <w:color w:val="1B1B1B"/>
+                <w:sz w:val="16"/>
+              </w:rPr>
             </w:r>
           </w:p>
           <w:p>
@@ -15673,7 +15821,11 @@
               </w:rPr>
             </w:pPr>
             <w:r>
-              <w:rPr/>
+              <w:rPr>
+                <w:rFonts w:cs="Consolas" w:ascii="Consolas" w:hAnsi="Consolas"/>
+                <w:color w:val="1B1B1B"/>
+                <w:sz w:val="16"/>
+              </w:rPr>
             </w:r>
           </w:p>
           <w:p>
@@ -16086,7 +16238,11 @@
               </w:rPr>
             </w:pPr>
             <w:r>
-              <w:rPr/>
+              <w:rPr>
+                <w:rFonts w:cs="Consolas" w:ascii="Consolas" w:hAnsi="Consolas"/>
+                <w:color w:val="1B1B1B"/>
+                <w:sz w:val="16"/>
+              </w:rPr>
             </w:r>
           </w:p>
           <w:p>
@@ -16119,7 +16275,11 @@
               </w:rPr>
             </w:pPr>
             <w:r>
-              <w:rPr/>
+              <w:rPr>
+                <w:rFonts w:cs="Consolas" w:ascii="Consolas" w:hAnsi="Consolas"/>
+                <w:color w:val="1B1B1B"/>
+                <w:sz w:val="16"/>
+              </w:rPr>
             </w:r>
           </w:p>
           <w:p>
@@ -16670,7 +16830,11 @@
               </w:rPr>
             </w:pPr>
             <w:r>
-              <w:rPr/>
+              <w:rPr>
+                <w:rFonts w:cs="Consolas" w:ascii="Consolas" w:hAnsi="Consolas"/>
+                <w:color w:val="1B1B1B"/>
+                <w:sz w:val="16"/>
+              </w:rPr>
             </w:r>
           </w:p>
           <w:p>
@@ -16891,8 +17055,8 @@
       <w:tblGrid>
         <w:gridCol w:w="1129"/>
         <w:gridCol w:w="1382"/>
-        <w:gridCol w:w="2007"/>
-        <w:gridCol w:w="4268"/>
+        <w:gridCol w:w="2006"/>
+        <w:gridCol w:w="4269"/>
       </w:tblGrid>
       <w:tr>
         <w:trPr>
@@ -16957,7 +17121,7 @@
         </w:tc>
         <w:tc>
           <w:tcPr>
-            <w:tcW w:w="2007" w:type="dxa"/>
+            <w:tcW w:w="2006" w:type="dxa"/>
             <w:tcBorders>
               <w:top w:val="single" w:sz="4" w:space="0" w:color="BFBFBF"/>
               <w:start w:val="single" w:sz="4" w:space="0" w:color="BFBFBF"/>
@@ -16985,7 +17149,7 @@
         </w:tc>
         <w:tc>
           <w:tcPr>
-            <w:tcW w:w="4268" w:type="dxa"/>
+            <w:tcW w:w="4269" w:type="dxa"/>
             <w:tcBorders>
               <w:top w:val="single" w:sz="4" w:space="0" w:color="BFBFBF"/>
               <w:start w:val="single" w:sz="4" w:space="0" w:color="BFBFBF"/>
@@ -17070,7 +17234,7 @@
         </w:tc>
         <w:tc>
           <w:tcPr>
-            <w:tcW w:w="2007" w:type="dxa"/>
+            <w:tcW w:w="2006" w:type="dxa"/>
             <w:tcBorders>
               <w:top w:val="single" w:sz="4" w:space="0" w:color="BFBFBF"/>
               <w:start w:val="single" w:sz="4" w:space="0" w:color="BFBFBF"/>
@@ -17096,7 +17260,7 @@
         </w:tc>
         <w:tc>
           <w:tcPr>
-            <w:tcW w:w="4268" w:type="dxa"/>
+            <w:tcW w:w="4269" w:type="dxa"/>
             <w:tcBorders>
               <w:top w:val="single" w:sz="4" w:space="0" w:color="BFBFBF"/>
               <w:start w:val="single" w:sz="4" w:space="0" w:color="BFBFBF"/>
@@ -17197,7 +17361,7 @@
         </w:tc>
         <w:tc>
           <w:tcPr>
-            <w:tcW w:w="2007" w:type="dxa"/>
+            <w:tcW w:w="2006" w:type="dxa"/>
             <w:tcBorders>
               <w:top w:val="single" w:sz="4" w:space="0" w:color="BFBFBF"/>
               <w:start w:val="single" w:sz="4" w:space="0" w:color="BFBFBF"/>
@@ -17224,7 +17388,7 @@
         </w:tc>
         <w:tc>
           <w:tcPr>
-            <w:tcW w:w="4268" w:type="dxa"/>
+            <w:tcW w:w="4269" w:type="dxa"/>
             <w:tcBorders>
               <w:top w:val="single" w:sz="4" w:space="0" w:color="BFBFBF"/>
               <w:start w:val="single" w:sz="4" w:space="0" w:color="BFBFBF"/>
@@ -17308,7 +17472,7 @@
         </w:tc>
         <w:tc>
           <w:tcPr>
-            <w:tcW w:w="2007" w:type="dxa"/>
+            <w:tcW w:w="2006" w:type="dxa"/>
             <w:tcBorders>
               <w:top w:val="single" w:sz="4" w:space="0" w:color="BFBFBF"/>
               <w:start w:val="single" w:sz="4" w:space="0" w:color="BFBFBF"/>
@@ -17334,7 +17498,7 @@
         </w:tc>
         <w:tc>
           <w:tcPr>
-            <w:tcW w:w="4268" w:type="dxa"/>
+            <w:tcW w:w="4269" w:type="dxa"/>
             <w:tcBorders>
               <w:top w:val="single" w:sz="4" w:space="0" w:color="BFBFBF"/>
               <w:start w:val="single" w:sz="4" w:space="0" w:color="BFBFBF"/>
@@ -17419,7 +17583,7 @@
         </w:tc>
         <w:tc>
           <w:tcPr>
-            <w:tcW w:w="2007" w:type="dxa"/>
+            <w:tcW w:w="2006" w:type="dxa"/>
             <w:tcBorders>
               <w:top w:val="single" w:sz="4" w:space="0" w:color="BFBFBF"/>
               <w:start w:val="single" w:sz="4" w:space="0" w:color="BFBFBF"/>
@@ -17446,7 +17610,7 @@
         </w:tc>
         <w:tc>
           <w:tcPr>
-            <w:tcW w:w="4268" w:type="dxa"/>
+            <w:tcW w:w="4269" w:type="dxa"/>
             <w:tcBorders>
               <w:top w:val="single" w:sz="4" w:space="0" w:color="BFBFBF"/>
               <w:start w:val="single" w:sz="4" w:space="0" w:color="BFBFBF"/>
@@ -17530,7 +17694,7 @@
         </w:tc>
         <w:tc>
           <w:tcPr>
-            <w:tcW w:w="2007" w:type="dxa"/>
+            <w:tcW w:w="2006" w:type="dxa"/>
             <w:tcBorders>
               <w:top w:val="single" w:sz="4" w:space="0" w:color="BFBFBF"/>
               <w:start w:val="single" w:sz="4" w:space="0" w:color="BFBFBF"/>
@@ -17556,7 +17720,7 @@
         </w:tc>
         <w:tc>
           <w:tcPr>
-            <w:tcW w:w="4268" w:type="dxa"/>
+            <w:tcW w:w="4269" w:type="dxa"/>
             <w:tcBorders>
               <w:top w:val="single" w:sz="4" w:space="0" w:color="BFBFBF"/>
               <w:start w:val="single" w:sz="4" w:space="0" w:color="BFBFBF"/>
@@ -17844,7 +18008,11 @@
               </w:rPr>
             </w:pPr>
             <w:r>
-              <w:rPr/>
+              <w:rPr>
+                <w:rFonts w:cs="Consolas" w:ascii="Consolas" w:hAnsi="Consolas"/>
+                <w:color w:val="1B1B1B"/>
+                <w:sz w:val="16"/>
+              </w:rPr>
             </w:r>
           </w:p>
           <w:p>
@@ -17960,7 +18128,11 @@
               </w:rPr>
             </w:pPr>
             <w:r>
-              <w:rPr/>
+              <w:rPr>
+                <w:rFonts w:cs="Consolas" w:ascii="Consolas" w:hAnsi="Consolas"/>
+                <w:color w:val="1B1B1B"/>
+                <w:sz w:val="16"/>
+              </w:rPr>
             </w:r>
           </w:p>
           <w:p>
@@ -18457,7 +18629,11 @@
               </w:rPr>
             </w:pPr>
             <w:r>
-              <w:rPr/>
+              <w:rPr>
+                <w:rFonts w:cs="Consolas" w:ascii="Consolas" w:hAnsi="Consolas"/>
+                <w:color w:val="1B1B1B"/>
+                <w:sz w:val="16"/>
+              </w:rPr>
             </w:r>
           </w:p>
           <w:p>
@@ -18490,7 +18666,11 @@
               </w:rPr>
             </w:pPr>
             <w:r>
-              <w:rPr/>
+              <w:rPr>
+                <w:rFonts w:cs="Consolas" w:ascii="Consolas" w:hAnsi="Consolas"/>
+                <w:color w:val="1B1B1B"/>
+                <w:sz w:val="16"/>
+              </w:rPr>
             </w:r>
           </w:p>
           <w:p>
@@ -18523,7 +18703,11 @@
               </w:rPr>
             </w:pPr>
             <w:r>
-              <w:rPr/>
+              <w:rPr>
+                <w:rFonts w:cs="Consolas" w:ascii="Consolas" w:hAnsi="Consolas"/>
+                <w:color w:val="1B1B1B"/>
+                <w:sz w:val="16"/>
+              </w:rPr>
             </w:r>
           </w:p>
           <w:p>
@@ -18556,7 +18740,11 @@
               </w:rPr>
             </w:pPr>
             <w:r>
-              <w:rPr/>
+              <w:rPr>
+                <w:rFonts w:cs="Consolas" w:ascii="Consolas" w:hAnsi="Consolas"/>
+                <w:color w:val="1B1B1B"/>
+                <w:sz w:val="16"/>
+              </w:rPr>
             </w:r>
           </w:p>
           <w:p>
@@ -18589,7 +18777,11 @@
               </w:rPr>
             </w:pPr>
             <w:r>
-              <w:rPr/>
+              <w:rPr>
+                <w:rFonts w:cs="Consolas" w:ascii="Consolas" w:hAnsi="Consolas"/>
+                <w:color w:val="1B1B1B"/>
+                <w:sz w:val="16"/>
+              </w:rPr>
             </w:r>
           </w:p>
           <w:p>
@@ -18906,7 +19098,11 @@
               </w:rPr>
             </w:pPr>
             <w:r>
-              <w:rPr/>
+              <w:rPr>
+                <w:rFonts w:cs="Consolas" w:ascii="Consolas" w:hAnsi="Consolas"/>
+                <w:color w:val="1B1B1B"/>
+                <w:sz w:val="16"/>
+              </w:rPr>
             </w:r>
           </w:p>
           <w:p>
@@ -19284,8 +19480,8 @@
       </w:tblPr>
       <w:tblGrid>
         <w:gridCol w:w="1156"/>
-        <w:gridCol w:w="2195"/>
-        <w:gridCol w:w="2429"/>
+        <w:gridCol w:w="2194"/>
+        <w:gridCol w:w="2430"/>
         <w:gridCol w:w="3006"/>
       </w:tblGrid>
       <w:tr>
@@ -19323,7 +19519,7 @@
         </w:tc>
         <w:tc>
           <w:tcPr>
-            <w:tcW w:w="2195" w:type="dxa"/>
+            <w:tcW w:w="2194" w:type="dxa"/>
             <w:tcBorders>
               <w:top w:val="single" w:sz="4" w:space="0" w:color="BFBFBF"/>
               <w:start w:val="single" w:sz="4" w:space="0" w:color="BFBFBF"/>
@@ -19351,7 +19547,7 @@
         </w:tc>
         <w:tc>
           <w:tcPr>
-            <w:tcW w:w="2429" w:type="dxa"/>
+            <w:tcW w:w="2430" w:type="dxa"/>
             <w:tcBorders>
               <w:top w:val="single" w:sz="4" w:space="0" w:color="BFBFBF"/>
               <w:start w:val="single" w:sz="4" w:space="0" w:color="BFBFBF"/>
@@ -19438,7 +19634,7 @@
         </w:tc>
         <w:tc>
           <w:tcPr>
-            <w:tcW w:w="2195" w:type="dxa"/>
+            <w:tcW w:w="2194" w:type="dxa"/>
             <w:tcBorders>
               <w:top w:val="single" w:sz="4" w:space="0" w:color="BFBFBF"/>
               <w:start w:val="single" w:sz="4" w:space="0" w:color="BFBFBF"/>
@@ -19481,7 +19677,7 @@
         </w:tc>
         <w:tc>
           <w:tcPr>
-            <w:tcW w:w="2429" w:type="dxa"/>
+            <w:tcW w:w="2430" w:type="dxa"/>
             <w:tcBorders>
               <w:top w:val="single" w:sz="4" w:space="0" w:color="BFBFBF"/>
               <w:start w:val="single" w:sz="4" w:space="0" w:color="BFBFBF"/>
@@ -19582,7 +19778,7 @@
         </w:tc>
         <w:tc>
           <w:tcPr>
-            <w:tcW w:w="2195" w:type="dxa"/>
+            <w:tcW w:w="2194" w:type="dxa"/>
             <w:tcBorders>
               <w:top w:val="single" w:sz="4" w:space="0" w:color="BFBFBF"/>
               <w:start w:val="single" w:sz="4" w:space="0" w:color="BFBFBF"/>
@@ -19626,7 +19822,7 @@
         </w:tc>
         <w:tc>
           <w:tcPr>
-            <w:tcW w:w="2429" w:type="dxa"/>
+            <w:tcW w:w="2430" w:type="dxa"/>
             <w:tcBorders>
               <w:top w:val="single" w:sz="4" w:space="0" w:color="BFBFBF"/>
               <w:start w:val="single" w:sz="4" w:space="0" w:color="BFBFBF"/>
@@ -19728,7 +19924,7 @@
         </w:tc>
         <w:tc>
           <w:tcPr>
-            <w:tcW w:w="2195" w:type="dxa"/>
+            <w:tcW w:w="2194" w:type="dxa"/>
             <w:tcBorders>
               <w:top w:val="single" w:sz="4" w:space="0" w:color="BFBFBF"/>
               <w:start w:val="single" w:sz="4" w:space="0" w:color="BFBFBF"/>
@@ -19771,7 +19967,7 @@
         </w:tc>
         <w:tc>
           <w:tcPr>
-            <w:tcW w:w="2429" w:type="dxa"/>
+            <w:tcW w:w="2430" w:type="dxa"/>
             <w:tcBorders>
               <w:top w:val="single" w:sz="4" w:space="0" w:color="BFBFBF"/>
               <w:start w:val="single" w:sz="4" w:space="0" w:color="BFBFBF"/>
@@ -20102,7 +20298,11 @@
               </w:rPr>
             </w:pPr>
             <w:r>
-              <w:rPr/>
+              <w:rPr>
+                <w:rFonts w:cs="Consolas" w:ascii="Consolas" w:hAnsi="Consolas"/>
+                <w:color w:val="1B1B1B"/>
+                <w:sz w:val="16"/>
+              </w:rPr>
             </w:r>
           </w:p>
           <w:p>
@@ -20268,7 +20468,11 @@
               </w:rPr>
             </w:pPr>
             <w:r>
-              <w:rPr/>
+              <w:rPr>
+                <w:rFonts w:cs="Consolas" w:ascii="Consolas" w:hAnsi="Consolas"/>
+                <w:color w:val="1B1B1B"/>
+                <w:sz w:val="16"/>
+              </w:rPr>
             </w:r>
           </w:p>
           <w:p>
@@ -20409,7 +20613,11 @@
               </w:rPr>
             </w:pPr>
             <w:r>
-              <w:rPr/>
+              <w:rPr>
+                <w:rFonts w:cs="Consolas" w:ascii="Consolas" w:hAnsi="Consolas"/>
+                <w:color w:val="1B1B1B"/>
+                <w:sz w:val="16"/>
+              </w:rPr>
             </w:r>
           </w:p>
           <w:p>
@@ -20500,7 +20708,11 @@
               </w:rPr>
             </w:pPr>
             <w:r>
-              <w:rPr/>
+              <w:rPr>
+                <w:rFonts w:cs="Consolas" w:ascii="Consolas" w:hAnsi="Consolas"/>
+                <w:color w:val="1B1B1B"/>
+                <w:sz w:val="16"/>
+              </w:rPr>
             </w:r>
           </w:p>
           <w:p>
@@ -20686,9 +20898,9 @@
         </w:tblCellMar>
       </w:tblPr>
       <w:tblGrid>
-        <w:gridCol w:w="2104"/>
+        <w:gridCol w:w="2103"/>
         <w:gridCol w:w="3216"/>
-        <w:gridCol w:w="3467"/>
+        <w:gridCol w:w="3468"/>
       </w:tblGrid>
       <w:tr>
         <w:trPr>
@@ -20697,7 +20909,7 @@
         </w:trPr>
         <w:tc>
           <w:tcPr>
-            <w:tcW w:w="2104" w:type="dxa"/>
+            <w:tcW w:w="2103" w:type="dxa"/>
             <w:tcBorders>
               <w:top w:val="single" w:sz="4" w:space="0" w:color="BFBFBF"/>
               <w:start w:val="single" w:sz="4" w:space="0" w:color="BFBFBF"/>
@@ -20753,7 +20965,7 @@
         </w:tc>
         <w:tc>
           <w:tcPr>
-            <w:tcW w:w="3467" w:type="dxa"/>
+            <w:tcW w:w="3468" w:type="dxa"/>
             <w:tcBorders>
               <w:top w:val="single" w:sz="4" w:space="0" w:color="BFBFBF"/>
               <w:start w:val="single" w:sz="4" w:space="0" w:color="BFBFBF"/>
@@ -20786,7 +20998,7 @@
         </w:trPr>
         <w:tc>
           <w:tcPr>
-            <w:tcW w:w="2104" w:type="dxa"/>
+            <w:tcW w:w="2103" w:type="dxa"/>
             <w:tcBorders>
               <w:top w:val="single" w:sz="4" w:space="0" w:color="BFBFBF"/>
               <w:start w:val="single" w:sz="4" w:space="0" w:color="BFBFBF"/>
@@ -20838,7 +21050,7 @@
         </w:tc>
         <w:tc>
           <w:tcPr>
-            <w:tcW w:w="3467" w:type="dxa"/>
+            <w:tcW w:w="3468" w:type="dxa"/>
             <w:tcBorders>
               <w:top w:val="single" w:sz="4" w:space="0" w:color="BFBFBF"/>
               <w:start w:val="single" w:sz="4" w:space="0" w:color="BFBFBF"/>
@@ -20878,7 +21090,7 @@
         </w:trPr>
         <w:tc>
           <w:tcPr>
-            <w:tcW w:w="2104" w:type="dxa"/>
+            <w:tcW w:w="2103" w:type="dxa"/>
             <w:tcBorders>
               <w:top w:val="single" w:sz="4" w:space="0" w:color="BFBFBF"/>
               <w:start w:val="single" w:sz="4" w:space="0" w:color="BFBFBF"/>
@@ -20932,7 +21144,7 @@
         </w:tc>
         <w:tc>
           <w:tcPr>
-            <w:tcW w:w="3467" w:type="dxa"/>
+            <w:tcW w:w="3468" w:type="dxa"/>
             <w:tcBorders>
               <w:top w:val="single" w:sz="4" w:space="0" w:color="BFBFBF"/>
               <w:start w:val="single" w:sz="4" w:space="0" w:color="BFBFBF"/>
@@ -20973,7 +21185,7 @@
         </w:trPr>
         <w:tc>
           <w:tcPr>
-            <w:tcW w:w="2104" w:type="dxa"/>
+            <w:tcW w:w="2103" w:type="dxa"/>
             <w:tcBorders>
               <w:top w:val="single" w:sz="4" w:space="0" w:color="BFBFBF"/>
               <w:start w:val="single" w:sz="4" w:space="0" w:color="BFBFBF"/>
@@ -21025,7 +21237,7 @@
         </w:tc>
         <w:tc>
           <w:tcPr>
-            <w:tcW w:w="3467" w:type="dxa"/>
+            <w:tcW w:w="3468" w:type="dxa"/>
             <w:tcBorders>
               <w:top w:val="single" w:sz="4" w:space="0" w:color="BFBFBF"/>
               <w:start w:val="single" w:sz="4" w:space="0" w:color="BFBFBF"/>
@@ -21058,7 +21270,7 @@
         </w:trPr>
         <w:tc>
           <w:tcPr>
-            <w:tcW w:w="2104" w:type="dxa"/>
+            <w:tcW w:w="2103" w:type="dxa"/>
             <w:tcBorders>
               <w:top w:val="single" w:sz="4" w:space="0" w:color="BFBFBF"/>
               <w:start w:val="single" w:sz="4" w:space="0" w:color="BFBFBF"/>
@@ -21112,7 +21324,7 @@
         </w:tc>
         <w:tc>
           <w:tcPr>
-            <w:tcW w:w="3467" w:type="dxa"/>
+            <w:tcW w:w="3468" w:type="dxa"/>
             <w:tcBorders>
               <w:top w:val="single" w:sz="4" w:space="0" w:color="BFBFBF"/>
               <w:start w:val="single" w:sz="4" w:space="0" w:color="BFBFBF"/>
@@ -21153,7 +21365,7 @@
         </w:trPr>
         <w:tc>
           <w:tcPr>
-            <w:tcW w:w="2104" w:type="dxa"/>
+            <w:tcW w:w="2103" w:type="dxa"/>
             <w:tcBorders>
               <w:top w:val="single" w:sz="4" w:space="0" w:color="BFBFBF"/>
               <w:start w:val="single" w:sz="4" w:space="0" w:color="BFBFBF"/>
@@ -21205,7 +21417,7 @@
         </w:tc>
         <w:tc>
           <w:tcPr>
-            <w:tcW w:w="3467" w:type="dxa"/>
+            <w:tcW w:w="3468" w:type="dxa"/>
             <w:tcBorders>
               <w:top w:val="single" w:sz="4" w:space="0" w:color="BFBFBF"/>
               <w:start w:val="single" w:sz="4" w:space="0" w:color="BFBFBF"/>
@@ -21245,7 +21457,7 @@
         </w:trPr>
         <w:tc>
           <w:tcPr>
-            <w:tcW w:w="2104" w:type="dxa"/>
+            <w:tcW w:w="2103" w:type="dxa"/>
             <w:tcBorders>
               <w:top w:val="single" w:sz="4" w:space="0" w:color="BFBFBF"/>
               <w:start w:val="single" w:sz="4" w:space="0" w:color="BFBFBF"/>
@@ -21299,7 +21511,7 @@
         </w:tc>
         <w:tc>
           <w:tcPr>
-            <w:tcW w:w="3467" w:type="dxa"/>
+            <w:tcW w:w="3468" w:type="dxa"/>
             <w:tcBorders>
               <w:top w:val="single" w:sz="4" w:space="0" w:color="BFBFBF"/>
               <w:start w:val="single" w:sz="4" w:space="0" w:color="BFBFBF"/>
@@ -21340,7 +21552,7 @@
         </w:trPr>
         <w:tc>
           <w:tcPr>
-            <w:tcW w:w="2104" w:type="dxa"/>
+            <w:tcW w:w="2103" w:type="dxa"/>
             <w:tcBorders>
               <w:top w:val="single" w:sz="4" w:space="0" w:color="BFBFBF"/>
               <w:start w:val="single" w:sz="4" w:space="0" w:color="BFBFBF"/>
@@ -21392,7 +21604,7 @@
         </w:tc>
         <w:tc>
           <w:tcPr>
-            <w:tcW w:w="3467" w:type="dxa"/>
+            <w:tcW w:w="3468" w:type="dxa"/>
             <w:tcBorders>
               <w:top w:val="single" w:sz="4" w:space="0" w:color="BFBFBF"/>
               <w:start w:val="single" w:sz="4" w:space="0" w:color="BFBFBF"/>
@@ -21432,7 +21644,7 @@
         </w:trPr>
         <w:tc>
           <w:tcPr>
-            <w:tcW w:w="2104" w:type="dxa"/>
+            <w:tcW w:w="2103" w:type="dxa"/>
             <w:tcBorders>
               <w:top w:val="single" w:sz="4" w:space="0" w:color="BFBFBF"/>
               <w:start w:val="single" w:sz="4" w:space="0" w:color="BFBFBF"/>
@@ -21486,7 +21698,7 @@
         </w:tc>
         <w:tc>
           <w:tcPr>
-            <w:tcW w:w="3467" w:type="dxa"/>
+            <w:tcW w:w="3468" w:type="dxa"/>
             <w:tcBorders>
               <w:top w:val="single" w:sz="4" w:space="0" w:color="BFBFBF"/>
               <w:start w:val="single" w:sz="4" w:space="0" w:color="BFBFBF"/>
@@ -21527,7 +21739,7 @@
         </w:trPr>
         <w:tc>
           <w:tcPr>
-            <w:tcW w:w="2104" w:type="dxa"/>
+            <w:tcW w:w="2103" w:type="dxa"/>
             <w:tcBorders>
               <w:top w:val="single" w:sz="4" w:space="0" w:color="BFBFBF"/>
               <w:start w:val="single" w:sz="4" w:space="0" w:color="BFBFBF"/>
@@ -21579,7 +21791,7 @@
         </w:tc>
         <w:tc>
           <w:tcPr>
-            <w:tcW w:w="3467" w:type="dxa"/>
+            <w:tcW w:w="3468" w:type="dxa"/>
             <w:tcBorders>
               <w:top w:val="single" w:sz="4" w:space="0" w:color="BFBFBF"/>
               <w:start w:val="single" w:sz="4" w:space="0" w:color="BFBFBF"/>
@@ -21619,7 +21831,7 @@
         </w:trPr>
         <w:tc>
           <w:tcPr>
-            <w:tcW w:w="2104" w:type="dxa"/>
+            <w:tcW w:w="2103" w:type="dxa"/>
             <w:tcBorders>
               <w:top w:val="single" w:sz="4" w:space="0" w:color="BFBFBF"/>
               <w:start w:val="single" w:sz="4" w:space="0" w:color="BFBFBF"/>
@@ -21673,7 +21885,7 @@
         </w:tc>
         <w:tc>
           <w:tcPr>
-            <w:tcW w:w="3467" w:type="dxa"/>
+            <w:tcW w:w="3468" w:type="dxa"/>
             <w:tcBorders>
               <w:top w:val="single" w:sz="4" w:space="0" w:color="BFBFBF"/>
               <w:start w:val="single" w:sz="4" w:space="0" w:color="BFBFBF"/>
@@ -21714,7 +21926,7 @@
         </w:trPr>
         <w:tc>
           <w:tcPr>
-            <w:tcW w:w="2104" w:type="dxa"/>
+            <w:tcW w:w="2103" w:type="dxa"/>
             <w:tcBorders>
               <w:top w:val="single" w:sz="4" w:space="0" w:color="BFBFBF"/>
               <w:start w:val="single" w:sz="4" w:space="0" w:color="BFBFBF"/>
@@ -21766,7 +21978,7 @@
         </w:tc>
         <w:tc>
           <w:tcPr>
-            <w:tcW w:w="3467" w:type="dxa"/>
+            <w:tcW w:w="3468" w:type="dxa"/>
             <w:tcBorders>
               <w:top w:val="single" w:sz="4" w:space="0" w:color="BFBFBF"/>
               <w:start w:val="single" w:sz="4" w:space="0" w:color="BFBFBF"/>
@@ -21806,7 +22018,7 @@
         </w:trPr>
         <w:tc>
           <w:tcPr>
-            <w:tcW w:w="2104" w:type="dxa"/>
+            <w:tcW w:w="2103" w:type="dxa"/>
             <w:tcBorders>
               <w:top w:val="single" w:sz="4" w:space="0" w:color="BFBFBF"/>
               <w:start w:val="single" w:sz="4" w:space="0" w:color="BFBFBF"/>
@@ -21860,7 +22072,7 @@
         </w:tc>
         <w:tc>
           <w:tcPr>
-            <w:tcW w:w="3467" w:type="dxa"/>
+            <w:tcW w:w="3468" w:type="dxa"/>
             <w:tcBorders>
               <w:top w:val="single" w:sz="4" w:space="0" w:color="BFBFBF"/>
               <w:start w:val="single" w:sz="4" w:space="0" w:color="BFBFBF"/>
@@ -21901,7 +22113,7 @@
         </w:trPr>
         <w:tc>
           <w:tcPr>
-            <w:tcW w:w="2104" w:type="dxa"/>
+            <w:tcW w:w="2103" w:type="dxa"/>
             <w:tcBorders>
               <w:top w:val="single" w:sz="4" w:space="0" w:color="BFBFBF"/>
               <w:start w:val="single" w:sz="4" w:space="0" w:color="BFBFBF"/>
@@ -21953,7 +22165,7 @@
         </w:tc>
         <w:tc>
           <w:tcPr>
-            <w:tcW w:w="3467" w:type="dxa"/>
+            <w:tcW w:w="3468" w:type="dxa"/>
             <w:tcBorders>
               <w:top w:val="single" w:sz="4" w:space="0" w:color="BFBFBF"/>
               <w:start w:val="single" w:sz="4" w:space="0" w:color="BFBFBF"/>
@@ -21993,7 +22205,7 @@
         </w:trPr>
         <w:tc>
           <w:tcPr>
-            <w:tcW w:w="2104" w:type="dxa"/>
+            <w:tcW w:w="2103" w:type="dxa"/>
             <w:tcBorders>
               <w:top w:val="single" w:sz="4" w:space="0" w:color="BFBFBF"/>
               <w:start w:val="single" w:sz="4" w:space="0" w:color="BFBFBF"/>
@@ -22047,7 +22259,7 @@
         </w:tc>
         <w:tc>
           <w:tcPr>
-            <w:tcW w:w="3467" w:type="dxa"/>
+            <w:tcW w:w="3468" w:type="dxa"/>
             <w:tcBorders>
               <w:top w:val="single" w:sz="4" w:space="0" w:color="BFBFBF"/>
               <w:start w:val="single" w:sz="4" w:space="0" w:color="BFBFBF"/>
@@ -22229,7 +22441,11 @@
               </w:rPr>
             </w:pPr>
             <w:r>
-              <w:rPr/>
+              <w:rPr>
+                <w:rFonts w:cs="Consolas" w:ascii="Consolas" w:hAnsi="Consolas"/>
+                <w:color w:val="1B1B1B"/>
+                <w:sz w:val="16"/>
+              </w:rPr>
             </w:r>
           </w:p>
           <w:p>
@@ -22395,7 +22611,11 @@
               </w:rPr>
             </w:pPr>
             <w:r>
-              <w:rPr/>
+              <w:rPr>
+                <w:rFonts w:cs="Consolas" w:ascii="Consolas" w:hAnsi="Consolas"/>
+                <w:color w:val="1B1B1B"/>
+                <w:sz w:val="16"/>
+              </w:rPr>
             </w:r>
           </w:p>
           <w:p>
@@ -23124,7 +23344,11 @@
               </w:rPr>
             </w:pPr>
             <w:r>
-              <w:rPr/>
+              <w:rPr>
+                <w:rFonts w:cs="Consolas" w:ascii="Consolas" w:hAnsi="Consolas"/>
+                <w:color w:val="1B1B1B"/>
+                <w:sz w:val="16"/>
+              </w:rPr>
             </w:r>
           </w:p>
           <w:p>
@@ -23155,7 +23379,11 @@
               </w:rPr>
             </w:pPr>
             <w:r>
-              <w:rPr/>
+              <w:rPr>
+                <w:rFonts w:cs="Consolas" w:ascii="Consolas" w:hAnsi="Consolas"/>
+                <w:color w:val="1B1B1B"/>
+                <w:sz w:val="16"/>
+              </w:rPr>
             </w:r>
           </w:p>
           <w:p>
@@ -23186,7 +23414,11 @@
               </w:rPr>
             </w:pPr>
             <w:r>
-              <w:rPr/>
+              <w:rPr>
+                <w:rFonts w:cs="Consolas" w:ascii="Consolas" w:hAnsi="Consolas"/>
+                <w:color w:val="1B1B1B"/>
+                <w:sz w:val="16"/>
+              </w:rPr>
             </w:r>
           </w:p>
           <w:p>
@@ -23217,7 +23449,11 @@
               </w:rPr>
             </w:pPr>
             <w:r>
-              <w:rPr/>
+              <w:rPr>
+                <w:rFonts w:cs="Consolas" w:ascii="Consolas" w:hAnsi="Consolas"/>
+                <w:color w:val="1B1B1B"/>
+                <w:sz w:val="16"/>
+              </w:rPr>
             </w:r>
           </w:p>
           <w:p>
@@ -23248,7 +23484,11 @@
               </w:rPr>
             </w:pPr>
             <w:r>
-              <w:rPr/>
+              <w:rPr>
+                <w:rFonts w:cs="Consolas" w:ascii="Consolas" w:hAnsi="Consolas"/>
+                <w:color w:val="1B1B1B"/>
+                <w:sz w:val="16"/>
+              </w:rPr>
             </w:r>
           </w:p>
           <w:p>
@@ -23279,7 +23519,11 @@
               </w:rPr>
             </w:pPr>
             <w:r>
-              <w:rPr/>
+              <w:rPr>
+                <w:rFonts w:cs="Consolas" w:ascii="Consolas" w:hAnsi="Consolas"/>
+                <w:color w:val="1B1B1B"/>
+                <w:sz w:val="16"/>
+              </w:rPr>
             </w:r>
           </w:p>
           <w:p>
@@ -23310,7 +23554,11 @@
               </w:rPr>
             </w:pPr>
             <w:r>
-              <w:rPr/>
+              <w:rPr>
+                <w:rFonts w:cs="Consolas" w:ascii="Consolas" w:hAnsi="Consolas"/>
+                <w:color w:val="1B1B1B"/>
+                <w:sz w:val="16"/>
+              </w:rPr>
             </w:r>
           </w:p>
           <w:p>
@@ -23477,7 +23725,11 @@
               </w:rPr>
             </w:pPr>
             <w:r>
-              <w:rPr/>
+              <w:rPr>
+                <w:rFonts w:cs="Consolas" w:ascii="Consolas" w:hAnsi="Consolas"/>
+                <w:color w:val="1B1B1B"/>
+                <w:sz w:val="16"/>
+              </w:rPr>
             </w:r>
           </w:p>
           <w:p>
@@ -23868,7 +24120,11 @@
               </w:rPr>
             </w:pPr>
             <w:r>
-              <w:rPr/>
+              <w:rPr>
+                <w:rFonts w:cs="Consolas" w:ascii="Consolas" w:hAnsi="Consolas"/>
+                <w:color w:val="1B1B1B"/>
+                <w:sz w:val="16"/>
+              </w:rPr>
             </w:r>
           </w:p>
           <w:p>
@@ -24343,7 +24599,11 @@
               </w:rPr>
             </w:pPr>
             <w:r>
-              <w:rPr/>
+              <w:rPr>
+                <w:rFonts w:cs="Consolas" w:ascii="Consolas" w:hAnsi="Consolas"/>
+                <w:color w:val="1B1B1B"/>
+                <w:sz w:val="15"/>
+              </w:rPr>
             </w:r>
           </w:p>
           <w:p>
@@ -25064,7 +25324,11 @@
               </w:rPr>
             </w:pPr>
             <w:r>
-              <w:rPr/>
+              <w:rPr>
+                <w:rFonts w:cs="Consolas" w:ascii="Consolas" w:hAnsi="Consolas"/>
+                <w:color w:val="1B1B1B"/>
+                <w:sz w:val="16"/>
+              </w:rPr>
             </w:r>
           </w:p>
           <w:p>
@@ -25155,7 +25419,11 @@
               </w:rPr>
             </w:pPr>
             <w:r>
-              <w:rPr/>
+              <w:rPr>
+                <w:rFonts w:cs="Consolas" w:ascii="Consolas" w:hAnsi="Consolas"/>
+                <w:color w:val="1B1B1B"/>
+                <w:sz w:val="16"/>
+              </w:rPr>
             </w:r>
           </w:p>
           <w:p>
@@ -25213,7 +25481,11 @@
               </w:rPr>
             </w:pPr>
             <w:r>
-              <w:rPr/>
+              <w:rPr>
+                <w:rFonts w:cs="Consolas" w:ascii="Consolas" w:hAnsi="Consolas"/>
+                <w:color w:val="1B1B1B"/>
+                <w:sz w:val="16"/>
+              </w:rPr>
             </w:r>
           </w:p>
           <w:p>
@@ -25633,7 +25905,11 @@
               </w:rPr>
             </w:pPr>
             <w:r>
-              <w:rPr/>
+              <w:rPr>
+                <w:rFonts w:cs="Consolas" w:ascii="Consolas" w:hAnsi="Consolas"/>
+                <w:color w:val="1B1B1B"/>
+                <w:sz w:val="16"/>
+              </w:rPr>
             </w:r>
           </w:p>
           <w:p>
@@ -25724,7 +26000,11 @@
               </w:rPr>
             </w:pPr>
             <w:r>
-              <w:rPr/>
+              <w:rPr>
+                <w:rFonts w:cs="Consolas" w:ascii="Consolas" w:hAnsi="Consolas"/>
+                <w:color w:val="1B1B1B"/>
+                <w:sz w:val="16"/>
+              </w:rPr>
             </w:r>
           </w:p>
           <w:p>
@@ -25815,7 +26095,11 @@
               </w:rPr>
             </w:pPr>
             <w:r>
-              <w:rPr/>
+              <w:rPr>
+                <w:rFonts w:cs="Consolas" w:ascii="Consolas" w:hAnsi="Consolas"/>
+                <w:color w:val="1B1B1B"/>
+                <w:sz w:val="16"/>
+              </w:rPr>
             </w:r>
           </w:p>
           <w:p>
@@ -25956,7 +26240,11 @@
               </w:rPr>
             </w:pPr>
             <w:r>
-              <w:rPr/>
+              <w:rPr>
+                <w:rFonts w:cs="Consolas" w:ascii="Consolas" w:hAnsi="Consolas"/>
+                <w:color w:val="1B1B1B"/>
+                <w:sz w:val="16"/>
+              </w:rPr>
             </w:r>
           </w:p>
           <w:p>
@@ -26047,7 +26335,11 @@
               </w:rPr>
             </w:pPr>
             <w:r>
-              <w:rPr/>
+              <w:rPr>
+                <w:rFonts w:cs="Consolas" w:ascii="Consolas" w:hAnsi="Consolas"/>
+                <w:color w:val="1B1B1B"/>
+                <w:sz w:val="16"/>
+              </w:rPr>
             </w:r>
           </w:p>
           <w:p>
@@ -26155,7 +26447,11 @@
               </w:rPr>
             </w:pPr>
             <w:r>
-              <w:rPr/>
+              <w:rPr>
+                <w:rFonts w:cs="Consolas" w:ascii="Consolas" w:hAnsi="Consolas"/>
+                <w:color w:val="1B1B1B"/>
+                <w:sz w:val="16"/>
+              </w:rPr>
             </w:r>
           </w:p>
           <w:p>
@@ -27118,7 +27414,11 @@
               </w:rPr>
             </w:pPr>
             <w:r>
-              <w:rPr/>
+              <w:rPr>
+                <w:rFonts w:cs="Consolas" w:ascii="Consolas" w:hAnsi="Consolas"/>
+                <w:color w:val="1B1B1B"/>
+                <w:sz w:val="16"/>
+              </w:rPr>
             </w:r>
           </w:p>
           <w:p>
@@ -27226,7 +27526,11 @@
               </w:rPr>
             </w:pPr>
             <w:r>
-              <w:rPr/>
+              <w:rPr>
+                <w:rFonts w:cs="Consolas" w:ascii="Consolas" w:hAnsi="Consolas"/>
+                <w:color w:val="1B1B1B"/>
+                <w:sz w:val="16"/>
+              </w:rPr>
             </w:r>
           </w:p>
           <w:p>
@@ -27292,7 +27596,11 @@
               </w:rPr>
             </w:pPr>
             <w:r>
-              <w:rPr/>
+              <w:rPr>
+                <w:rFonts w:cs="Consolas" w:ascii="Consolas" w:hAnsi="Consolas"/>
+                <w:color w:val="1B1B1B"/>
+                <w:sz w:val="16"/>
+              </w:rPr>
             </w:r>
           </w:p>
           <w:p>
@@ -27358,7 +27666,11 @@
               </w:rPr>
             </w:pPr>
             <w:r>
-              <w:rPr/>
+              <w:rPr>
+                <w:rFonts w:cs="Consolas" w:ascii="Consolas" w:hAnsi="Consolas"/>
+                <w:color w:val="1B1B1B"/>
+                <w:sz w:val="16"/>
+              </w:rPr>
             </w:r>
           </w:p>
           <w:p>
@@ -27877,7 +28189,11 @@
               </w:rPr>
             </w:pPr>
             <w:r>
-              <w:rPr/>
+              <w:rPr>
+                <w:rFonts w:cs="Consolas" w:ascii="Consolas" w:hAnsi="Consolas"/>
+                <w:color w:val="1B1B1B"/>
+                <w:sz w:val="16"/>
+              </w:rPr>
             </w:r>
           </w:p>
           <w:p>
@@ -27940,7 +28256,11 @@
               </w:rPr>
             </w:pPr>
             <w:r>
-              <w:rPr/>
+              <w:rPr>
+                <w:rFonts w:cs="Consolas" w:ascii="Consolas" w:hAnsi="Consolas"/>
+                <w:color w:val="1B1B1B"/>
+                <w:sz w:val="16"/>
+              </w:rPr>
             </w:r>
           </w:p>
           <w:p>
@@ -28027,7 +28347,11 @@
               </w:rPr>
             </w:pPr>
             <w:r>
-              <w:rPr/>
+              <w:rPr>
+                <w:rFonts w:cs="Consolas" w:ascii="Consolas" w:hAnsi="Consolas"/>
+                <w:color w:val="1B1B1B"/>
+                <w:sz w:val="16"/>
+              </w:rPr>
             </w:r>
           </w:p>
           <w:p>
@@ -28066,7 +28390,11 @@
               </w:rPr>
             </w:pPr>
             <w:r>
-              <w:rPr/>
+              <w:rPr>
+                <w:rFonts w:cs="Consolas" w:ascii="Consolas" w:hAnsi="Consolas"/>
+                <w:color w:val="1B1B1B"/>
+                <w:sz w:val="16"/>
+              </w:rPr>
             </w:r>
           </w:p>
           <w:p>
@@ -28105,7 +28433,11 @@
               </w:rPr>
             </w:pPr>
             <w:r>
-              <w:rPr/>
+              <w:rPr>
+                <w:rFonts w:cs="Consolas" w:ascii="Consolas" w:hAnsi="Consolas"/>
+                <w:color w:val="1B1B1B"/>
+                <w:sz w:val="16"/>
+              </w:rPr>
             </w:r>
           </w:p>
           <w:p>
@@ -28160,7 +28492,11 @@
               </w:rPr>
             </w:pPr>
             <w:r>
-              <w:rPr/>
+              <w:rPr>
+                <w:rFonts w:cs="Consolas" w:ascii="Consolas" w:hAnsi="Consolas"/>
+                <w:color w:val="1B1B1B"/>
+                <w:sz w:val="16"/>
+              </w:rPr>
             </w:r>
           </w:p>
           <w:p>
@@ -28279,7 +28615,11 @@
               </w:rPr>
             </w:pPr>
             <w:r>
-              <w:rPr/>
+              <w:rPr>
+                <w:rFonts w:cs="Consolas" w:ascii="Consolas" w:hAnsi="Consolas"/>
+                <w:color w:val="1B1B1B"/>
+                <w:sz w:val="16"/>
+              </w:rPr>
             </w:r>
           </w:p>
           <w:p>
@@ -28310,7 +28650,11 @@
               </w:rPr>
             </w:pPr>
             <w:r>
-              <w:rPr/>
+              <w:rPr>
+                <w:rFonts w:cs="Consolas" w:ascii="Consolas" w:hAnsi="Consolas"/>
+                <w:color w:val="1B1B1B"/>
+                <w:sz w:val="16"/>
+              </w:rPr>
             </w:r>
           </w:p>
           <w:p>
@@ -28341,7 +28685,11 @@
               </w:rPr>
             </w:pPr>
             <w:r>
-              <w:rPr/>
+              <w:rPr>
+                <w:rFonts w:cs="Consolas" w:ascii="Consolas" w:hAnsi="Consolas"/>
+                <w:color w:val="1B1B1B"/>
+                <w:sz w:val="16"/>
+              </w:rPr>
             </w:r>
           </w:p>
           <w:p>
@@ -28628,7 +28976,11 @@
               </w:rPr>
             </w:pPr>
             <w:r>
-              <w:rPr/>
+              <w:rPr>
+                <w:rFonts w:cs="Consolas" w:ascii="Consolas" w:hAnsi="Consolas"/>
+                <w:color w:val="1B1B1B"/>
+                <w:sz w:val="16"/>
+              </w:rPr>
             </w:r>
           </w:p>
           <w:p>
@@ -28899,7 +29251,11 @@
               </w:rPr>
             </w:pPr>
             <w:r>
-              <w:rPr/>
+              <w:rPr>
+                <w:rFonts w:cs="Consolas" w:ascii="Consolas" w:hAnsi="Consolas"/>
+                <w:color w:val="1B1B1B"/>
+                <w:sz w:val="16"/>
+              </w:rPr>
             </w:r>
           </w:p>
           <w:p>
@@ -29370,7 +29726,11 @@
               </w:rPr>
             </w:pPr>
             <w:r>
-              <w:rPr/>
+              <w:rPr>
+                <w:rFonts w:cs="Consolas" w:ascii="Consolas" w:hAnsi="Consolas"/>
+                <w:color w:val="1B1B1B"/>
+                <w:sz w:val="16"/>
+              </w:rPr>
             </w:r>
           </w:p>
           <w:p>
@@ -29470,7 +29830,11 @@
               </w:rPr>
             </w:pPr>
             <w:r>
-              <w:rPr/>
+              <w:rPr>
+                <w:rFonts w:cs="Consolas" w:ascii="Consolas" w:hAnsi="Consolas"/>
+                <w:color w:val="1B1B1B"/>
+                <w:sz w:val="16"/>
+              </w:rPr>
             </w:r>
           </w:p>
           <w:p>
@@ -29906,7 +30270,11 @@
               </w:rPr>
             </w:pPr>
             <w:r>
-              <w:rPr/>
+              <w:rPr>
+                <w:rFonts w:cs="Consolas" w:ascii="Consolas" w:hAnsi="Consolas"/>
+                <w:color w:val="1B1B1B"/>
+                <w:sz w:val="16"/>
+              </w:rPr>
             </w:r>
           </w:p>
           <w:p>
@@ -29981,7 +30349,11 @@
               </w:rPr>
             </w:pPr>
             <w:r>
-              <w:rPr/>
+              <w:rPr>
+                <w:rFonts w:cs="Consolas" w:ascii="Consolas" w:hAnsi="Consolas"/>
+                <w:color w:val="1B1B1B"/>
+                <w:sz w:val="16"/>
+              </w:rPr>
             </w:r>
           </w:p>
           <w:p>
@@ -30439,7 +30811,11 @@
               </w:rPr>
             </w:pPr>
             <w:r>
-              <w:rPr/>
+              <w:rPr>
+                <w:rFonts w:cs="Consolas" w:ascii="Consolas" w:hAnsi="Consolas"/>
+                <w:color w:val="1B1B1B"/>
+                <w:sz w:val="16"/>
+              </w:rPr>
             </w:r>
           </w:p>
           <w:p>
@@ -30514,7 +30890,11 @@
               </w:rPr>
             </w:pPr>
             <w:r>
-              <w:rPr/>
+              <w:rPr>
+                <w:rFonts w:cs="Consolas" w:ascii="Consolas" w:hAnsi="Consolas"/>
+                <w:color w:val="1B1B1B"/>
+                <w:sz w:val="16"/>
+              </w:rPr>
             </w:r>
           </w:p>
           <w:p>
@@ -30681,7 +31061,11 @@
               </w:rPr>
             </w:pPr>
             <w:r>
-              <w:rPr/>
+              <w:rPr>
+                <w:rFonts w:cs="Consolas" w:ascii="Consolas" w:hAnsi="Consolas"/>
+                <w:color w:val="1B1B1B"/>
+                <w:sz w:val="16"/>
+              </w:rPr>
             </w:r>
           </w:p>
           <w:p>
@@ -31102,7 +31486,11 @@
               </w:rPr>
             </w:pPr>
             <w:r>
-              <w:rPr/>
+              <w:rPr>
+                <w:rFonts w:cs="Consolas" w:ascii="Consolas" w:hAnsi="Consolas"/>
+                <w:color w:val="1B1B1B"/>
+                <w:sz w:val="16"/>
+              </w:rPr>
             </w:r>
           </w:p>
           <w:p>
@@ -31302,7 +31690,11 @@
               </w:rPr>
             </w:pPr>
             <w:r>
-              <w:rPr/>
+              <w:rPr>
+                <w:rFonts w:cs="Consolas" w:ascii="Consolas" w:hAnsi="Consolas"/>
+                <w:color w:val="1B1B1B"/>
+                <w:sz w:val="16"/>
+              </w:rPr>
             </w:r>
           </w:p>
           <w:p>
@@ -31670,7 +32062,11 @@
               </w:rPr>
             </w:pPr>
             <w:r>
-              <w:rPr/>
+              <w:rPr>
+                <w:rFonts w:cs="Consolas" w:ascii="Consolas" w:hAnsi="Consolas"/>
+                <w:color w:val="1B1B1B"/>
+                <w:sz w:val="16"/>
+              </w:rPr>
             </w:r>
           </w:p>
           <w:p>
@@ -31728,7 +32124,11 @@
               </w:rPr>
             </w:pPr>
             <w:r>
-              <w:rPr/>
+              <w:rPr>
+                <w:rFonts w:cs="Consolas" w:ascii="Consolas" w:hAnsi="Consolas"/>
+                <w:color w:val="1B1B1B"/>
+                <w:sz w:val="16"/>
+              </w:rPr>
             </w:r>
           </w:p>
           <w:p>
@@ -31853,7 +32253,11 @@
               </w:rPr>
             </w:pPr>
             <w:r>
-              <w:rPr/>
+              <w:rPr>
+                <w:rFonts w:cs="Consolas" w:ascii="Consolas" w:hAnsi="Consolas"/>
+                <w:color w:val="1B1B1B"/>
+                <w:sz w:val="16"/>
+              </w:rPr>
             </w:r>
           </w:p>
           <w:p>
@@ -32266,7 +32670,11 @@
               </w:rPr>
             </w:pPr>
             <w:r>
-              <w:rPr/>
+              <w:rPr>
+                <w:rFonts w:cs="Consolas" w:ascii="Consolas" w:hAnsi="Consolas"/>
+                <w:color w:val="1B1B1B"/>
+                <w:sz w:val="16"/>
+              </w:rPr>
             </w:r>
           </w:p>
           <w:p>
@@ -32391,7 +32799,11 @@
               </w:rPr>
             </w:pPr>
             <w:r>
-              <w:rPr/>
+              <w:rPr>
+                <w:rFonts w:cs="Consolas" w:ascii="Consolas" w:hAnsi="Consolas"/>
+                <w:color w:val="1B1B1B"/>
+                <w:sz w:val="16"/>
+              </w:rPr>
             </w:r>
           </w:p>
           <w:p>
@@ -32529,9 +32941,9 @@
         </w:tblCellMar>
       </w:tblPr>
       <w:tblGrid>
-        <w:gridCol w:w="1441"/>
+        <w:gridCol w:w="1440"/>
         <w:gridCol w:w="3409"/>
-        <w:gridCol w:w="3936"/>
+        <w:gridCol w:w="3937"/>
       </w:tblGrid>
       <w:tr>
         <w:trPr>
@@ -32540,7 +32952,7 @@
         </w:trPr>
         <w:tc>
           <w:tcPr>
-            <w:tcW w:w="1441" w:type="dxa"/>
+            <w:tcW w:w="1440" w:type="dxa"/>
             <w:tcBorders>
               <w:top w:val="single" w:sz="4" w:space="0" w:color="BFBFBF"/>
               <w:start w:val="single" w:sz="4" w:space="0" w:color="BFBFBF"/>
@@ -32591,7 +33003,7 @@
         </w:tc>
         <w:tc>
           <w:tcPr>
-            <w:tcW w:w="3936" w:type="dxa"/>
+            <w:tcW w:w="3937" w:type="dxa"/>
             <w:tcBorders>
               <w:top w:val="single" w:sz="4" w:space="0" w:color="BFBFBF"/>
               <w:start w:val="single" w:sz="4" w:space="0" w:color="BFBFBF"/>
@@ -32624,7 +33036,7 @@
         </w:trPr>
         <w:tc>
           <w:tcPr>
-            <w:tcW w:w="1441" w:type="dxa"/>
+            <w:tcW w:w="1440" w:type="dxa"/>
             <w:tcBorders>
               <w:top w:val="single" w:sz="4" w:space="0" w:color="BFBFBF"/>
               <w:start w:val="single" w:sz="4" w:space="0" w:color="BFBFBF"/>
@@ -32676,7 +33088,7 @@
         </w:tc>
         <w:tc>
           <w:tcPr>
-            <w:tcW w:w="3936" w:type="dxa"/>
+            <w:tcW w:w="3937" w:type="dxa"/>
             <w:tcBorders>
               <w:top w:val="single" w:sz="4" w:space="0" w:color="BFBFBF"/>
               <w:start w:val="single" w:sz="4" w:space="0" w:color="BFBFBF"/>
@@ -32707,7 +33119,7 @@
         </w:trPr>
         <w:tc>
           <w:tcPr>
-            <w:tcW w:w="1441" w:type="dxa"/>
+            <w:tcW w:w="1440" w:type="dxa"/>
             <w:tcBorders>
               <w:top w:val="single" w:sz="4" w:space="0" w:color="BFBFBF"/>
               <w:start w:val="single" w:sz="4" w:space="0" w:color="BFBFBF"/>
@@ -32761,7 +33173,7 @@
         </w:tc>
         <w:tc>
           <w:tcPr>
-            <w:tcW w:w="3936" w:type="dxa"/>
+            <w:tcW w:w="3937" w:type="dxa"/>
             <w:tcBorders>
               <w:top w:val="single" w:sz="4" w:space="0" w:color="BFBFBF"/>
               <w:start w:val="single" w:sz="4" w:space="0" w:color="BFBFBF"/>
@@ -32793,7 +33205,7 @@
         </w:trPr>
         <w:tc>
           <w:tcPr>
-            <w:tcW w:w="1441" w:type="dxa"/>
+            <w:tcW w:w="1440" w:type="dxa"/>
             <w:tcBorders>
               <w:top w:val="single" w:sz="4" w:space="0" w:color="BFBFBF"/>
               <w:start w:val="single" w:sz="4" w:space="0" w:color="BFBFBF"/>
@@ -32845,7 +33257,7 @@
         </w:tc>
         <w:tc>
           <w:tcPr>
-            <w:tcW w:w="3936" w:type="dxa"/>
+            <w:tcW w:w="3937" w:type="dxa"/>
             <w:tcBorders>
               <w:top w:val="single" w:sz="4" w:space="0" w:color="BFBFBF"/>
               <w:start w:val="single" w:sz="4" w:space="0" w:color="BFBFBF"/>
@@ -33248,7 +33660,11 @@
               </w:rPr>
             </w:pPr>
             <w:r>
-              <w:rPr/>
+              <w:rPr>
+                <w:rFonts w:cs="Consolas" w:ascii="Consolas" w:hAnsi="Consolas"/>
+                <w:color w:val="1B1B1B"/>
+                <w:sz w:val="16"/>
+              </w:rPr>
             </w:r>
           </w:p>
           <w:p>
@@ -33319,7 +33735,11 @@
               </w:rPr>
             </w:pPr>
             <w:r>
-              <w:rPr/>
+              <w:rPr>
+                <w:rFonts w:cs="Consolas" w:ascii="Consolas" w:hAnsi="Consolas"/>
+                <w:color w:val="1B1B1B"/>
+                <w:sz w:val="16"/>
+              </w:rPr>
             </w:r>
           </w:p>
           <w:p>
@@ -33414,7 +33834,11 @@
               </w:rPr>
             </w:pPr>
             <w:r>
-              <w:rPr/>
+              <w:rPr>
+                <w:rFonts w:cs="Consolas" w:ascii="Consolas" w:hAnsi="Consolas"/>
+                <w:color w:val="1B1B1B"/>
+                <w:sz w:val="16"/>
+              </w:rPr>
             </w:r>
           </w:p>
           <w:p>
@@ -33533,7 +33957,11 @@
               </w:rPr>
             </w:pPr>
             <w:r>
-              <w:rPr/>
+              <w:rPr>
+                <w:rFonts w:cs="Consolas" w:ascii="Consolas" w:hAnsi="Consolas"/>
+                <w:color w:val="1B1B1B"/>
+                <w:sz w:val="16"/>
+              </w:rPr>
             </w:r>
           </w:p>
           <w:p>
@@ -33644,7 +34072,11 @@
               </w:rPr>
             </w:pPr>
             <w:r>
-              <w:rPr/>
+              <w:rPr>
+                <w:rFonts w:cs="Consolas" w:ascii="Consolas" w:hAnsi="Consolas"/>
+                <w:color w:val="1B1B1B"/>
+                <w:sz w:val="16"/>
+              </w:rPr>
             </w:r>
           </w:p>
           <w:p>
@@ -33851,7 +34283,11 @@
               </w:rPr>
             </w:pPr>
             <w:r>
-              <w:rPr/>
+              <w:rPr>
+                <w:rFonts w:cs="Consolas" w:ascii="Consolas" w:hAnsi="Consolas"/>
+                <w:color w:val="1B1B1B"/>
+                <w:sz w:val="16"/>
+              </w:rPr>
             </w:r>
           </w:p>
           <w:p>
@@ -33882,7 +34318,11 @@
               </w:rPr>
             </w:pPr>
             <w:r>
-              <w:rPr/>
+              <w:rPr>
+                <w:rFonts w:cs="Consolas" w:ascii="Consolas" w:hAnsi="Consolas"/>
+                <w:color w:val="1B1B1B"/>
+                <w:sz w:val="16"/>
+              </w:rPr>
             </w:r>
           </w:p>
           <w:p>
@@ -33913,7 +34353,11 @@
               </w:rPr>
             </w:pPr>
             <w:r>
-              <w:rPr/>
+              <w:rPr>
+                <w:rFonts w:cs="Consolas" w:ascii="Consolas" w:hAnsi="Consolas"/>
+                <w:color w:val="1B1B1B"/>
+                <w:sz w:val="16"/>
+              </w:rPr>
             </w:r>
           </w:p>
           <w:p>
@@ -34032,7 +34476,11 @@
               </w:rPr>
             </w:pPr>
             <w:r>
-              <w:rPr/>
+              <w:rPr>
+                <w:rFonts w:cs="Consolas" w:ascii="Consolas" w:hAnsi="Consolas"/>
+                <w:color w:val="1B1B1B"/>
+                <w:sz w:val="16"/>
+              </w:rPr>
             </w:r>
           </w:p>
           <w:p>
@@ -34543,7 +34991,11 @@
               </w:rPr>
             </w:pPr>
             <w:r>
-              <w:rPr/>
+              <w:rPr>
+                <w:rFonts w:cs="Consolas" w:ascii="Consolas" w:hAnsi="Consolas"/>
+                <w:color w:val="1B1B1B"/>
+                <w:sz w:val="16"/>
+              </w:rPr>
             </w:r>
           </w:p>
           <w:p>
@@ -34970,7 +35422,7 @@
     </w:p>
     <w:tbl>
       <w:tblPr>
-        <w:tblW w:w="8786" w:type="dxa"/>
+        <w:tblW w:w="8787" w:type="dxa"/>
         <w:jc w:val="center"/>
         <w:tblInd w:w="0" w:type="dxa"/>
         <w:tblLayout w:type="fixed"/>
@@ -34983,7 +35435,7 @@
       </w:tblPr>
       <w:tblGrid>
         <w:gridCol w:w="1922"/>
-        <w:gridCol w:w="6864"/>
+        <w:gridCol w:w="6865"/>
       </w:tblGrid>
       <w:tr>
         <w:trPr>
@@ -35020,7 +35472,7 @@
         </w:tc>
         <w:tc>
           <w:tcPr>
-            <w:tcW w:w="6864" w:type="dxa"/>
+            <w:tcW w:w="6865" w:type="dxa"/>
             <w:tcBorders>
               <w:top w:val="single" w:sz="4" w:space="0" w:color="BFBFBF"/>
               <w:start w:val="single" w:sz="4" w:space="0" w:color="BFBFBF"/>
@@ -35079,7 +35531,7 @@
         </w:tc>
         <w:tc>
           <w:tcPr>
-            <w:tcW w:w="6864" w:type="dxa"/>
+            <w:tcW w:w="6865" w:type="dxa"/>
             <w:tcBorders>
               <w:top w:val="single" w:sz="4" w:space="0" w:color="BFBFBF"/>
               <w:start w:val="single" w:sz="4" w:space="0" w:color="BFBFBF"/>
@@ -35137,7 +35589,7 @@
         </w:tc>
         <w:tc>
           <w:tcPr>
-            <w:tcW w:w="6864" w:type="dxa"/>
+            <w:tcW w:w="6865" w:type="dxa"/>
             <w:tcBorders>
               <w:top w:val="single" w:sz="4" w:space="0" w:color="BFBFBF"/>
               <w:start w:val="single" w:sz="4" w:space="0" w:color="BFBFBF"/>
@@ -35195,7 +35647,7 @@
         </w:tc>
         <w:tc>
           <w:tcPr>
-            <w:tcW w:w="6864" w:type="dxa"/>
+            <w:tcW w:w="6865" w:type="dxa"/>
             <w:tcBorders>
               <w:top w:val="single" w:sz="4" w:space="0" w:color="BFBFBF"/>
               <w:start w:val="single" w:sz="4" w:space="0" w:color="BFBFBF"/>
@@ -35253,7 +35705,7 @@
         </w:tc>
         <w:tc>
           <w:tcPr>
-            <w:tcW w:w="6864" w:type="dxa"/>
+            <w:tcW w:w="6865" w:type="dxa"/>
             <w:tcBorders>
               <w:top w:val="single" w:sz="4" w:space="0" w:color="BFBFBF"/>
               <w:start w:val="single" w:sz="4" w:space="0" w:color="BFBFBF"/>
@@ -35311,7 +35763,7 @@
         </w:tc>
         <w:tc>
           <w:tcPr>
-            <w:tcW w:w="6864" w:type="dxa"/>
+            <w:tcW w:w="6865" w:type="dxa"/>
             <w:tcBorders>
               <w:top w:val="single" w:sz="4" w:space="0" w:color="BFBFBF"/>
               <w:start w:val="single" w:sz="4" w:space="0" w:color="BFBFBF"/>
@@ -35421,7 +35873,11 @@
               </w:rPr>
             </w:pPr>
             <w:r>
-              <w:rPr/>
+              <w:rPr>
+                <w:rFonts w:cs="Consolas" w:ascii="Consolas" w:hAnsi="Consolas"/>
+                <w:color w:val="1B1B1B"/>
+                <w:sz w:val="16"/>
+              </w:rPr>
             </w:r>
           </w:p>
           <w:p>
@@ -35739,7 +36195,11 @@
               </w:rPr>
             </w:pPr>
             <w:r>
-              <w:rPr/>
+              <w:rPr>
+                <w:rFonts w:cs="Consolas" w:ascii="Consolas" w:hAnsi="Consolas"/>
+                <w:color w:val="1B1B1B"/>
+                <w:sz w:val="16"/>
+              </w:rPr>
             </w:r>
           </w:p>
           <w:p>
@@ -35839,7 +36299,11 @@
               </w:rPr>
             </w:pPr>
             <w:r>
-              <w:rPr/>
+              <w:rPr>
+                <w:rFonts w:cs="Consolas" w:ascii="Consolas" w:hAnsi="Consolas"/>
+                <w:color w:val="1B1B1B"/>
+                <w:sz w:val="16"/>
+              </w:rPr>
             </w:r>
           </w:p>
           <w:p>
@@ -35939,7 +36403,11 @@
               </w:rPr>
             </w:pPr>
             <w:r>
-              <w:rPr/>
+              <w:rPr>
+                <w:rFonts w:cs="Consolas" w:ascii="Consolas" w:hAnsi="Consolas"/>
+                <w:color w:val="1B1B1B"/>
+                <w:sz w:val="16"/>
+              </w:rPr>
             </w:r>
           </w:p>
           <w:p>
@@ -36122,7 +36590,11 @@
               </w:rPr>
             </w:pPr>
             <w:r>
-              <w:rPr/>
+              <w:rPr>
+                <w:rFonts w:cs="Consolas" w:ascii="Consolas" w:hAnsi="Consolas"/>
+                <w:color w:val="1B1B1B"/>
+                <w:sz w:val="16"/>
+              </w:rPr>
             </w:r>
           </w:p>
           <w:p>
@@ -36414,7 +36886,11 @@
               </w:rPr>
             </w:pPr>
             <w:r>
-              <w:rPr/>
+              <w:rPr>
+                <w:rFonts w:cs="Consolas" w:ascii="Consolas" w:hAnsi="Consolas"/>
+                <w:color w:val="1B1B1B"/>
+                <w:sz w:val="16"/>
+              </w:rPr>
             </w:r>
           </w:p>
           <w:p>
@@ -36741,8 +37217,8 @@
         </w:tblCellMar>
       </w:tblPr>
       <w:tblGrid>
-        <w:gridCol w:w="2129"/>
-        <w:gridCol w:w="6657"/>
+        <w:gridCol w:w="2128"/>
+        <w:gridCol w:w="6658"/>
       </w:tblGrid>
       <w:tr>
         <w:trPr>
@@ -36751,7 +37227,7 @@
         </w:trPr>
         <w:tc>
           <w:tcPr>
-            <w:tcW w:w="2129" w:type="dxa"/>
+            <w:tcW w:w="2128" w:type="dxa"/>
             <w:tcBorders>
               <w:top w:val="single" w:sz="4" w:space="0" w:color="BFBFBF"/>
               <w:start w:val="single" w:sz="4" w:space="0" w:color="BFBFBF"/>
@@ -36779,7 +37255,7 @@
         </w:tc>
         <w:tc>
           <w:tcPr>
-            <w:tcW w:w="6657" w:type="dxa"/>
+            <w:tcW w:w="6658" w:type="dxa"/>
             <w:tcBorders>
               <w:top w:val="single" w:sz="4" w:space="0" w:color="BFBFBF"/>
               <w:start w:val="single" w:sz="4" w:space="0" w:color="BFBFBF"/>
@@ -36812,7 +37288,7 @@
         </w:trPr>
         <w:tc>
           <w:tcPr>
-            <w:tcW w:w="2129" w:type="dxa"/>
+            <w:tcW w:w="2128" w:type="dxa"/>
             <w:tcBorders>
               <w:top w:val="single" w:sz="4" w:space="0" w:color="BFBFBF"/>
               <w:start w:val="single" w:sz="4" w:space="0" w:color="BFBFBF"/>
@@ -36838,7 +37314,7 @@
         </w:tc>
         <w:tc>
           <w:tcPr>
-            <w:tcW w:w="6657" w:type="dxa"/>
+            <w:tcW w:w="6658" w:type="dxa"/>
             <w:tcBorders>
               <w:top w:val="single" w:sz="4" w:space="0" w:color="BFBFBF"/>
               <w:start w:val="single" w:sz="4" w:space="0" w:color="BFBFBF"/>
@@ -36869,7 +37345,7 @@
         </w:trPr>
         <w:tc>
           <w:tcPr>
-            <w:tcW w:w="2129" w:type="dxa"/>
+            <w:tcW w:w="2128" w:type="dxa"/>
             <w:tcBorders>
               <w:top w:val="single" w:sz="4" w:space="0" w:color="BFBFBF"/>
               <w:start w:val="single" w:sz="4" w:space="0" w:color="BFBFBF"/>
@@ -36896,7 +37372,7 @@
         </w:tc>
         <w:tc>
           <w:tcPr>
-            <w:tcW w:w="6657" w:type="dxa"/>
+            <w:tcW w:w="6658" w:type="dxa"/>
             <w:tcBorders>
               <w:top w:val="single" w:sz="4" w:space="0" w:color="BFBFBF"/>
               <w:start w:val="single" w:sz="4" w:space="0" w:color="BFBFBF"/>
@@ -36928,7 +37404,7 @@
         </w:trPr>
         <w:tc>
           <w:tcPr>
-            <w:tcW w:w="2129" w:type="dxa"/>
+            <w:tcW w:w="2128" w:type="dxa"/>
             <w:tcBorders>
               <w:top w:val="single" w:sz="4" w:space="0" w:color="BFBFBF"/>
               <w:start w:val="single" w:sz="4" w:space="0" w:color="BFBFBF"/>
@@ -36954,7 +37430,7 @@
         </w:tc>
         <w:tc>
           <w:tcPr>
-            <w:tcW w:w="6657" w:type="dxa"/>
+            <w:tcW w:w="6658" w:type="dxa"/>
             <w:tcBorders>
               <w:top w:val="single" w:sz="4" w:space="0" w:color="BFBFBF"/>
               <w:start w:val="single" w:sz="4" w:space="0" w:color="BFBFBF"/>
@@ -37439,7 +37915,11 @@
               </w:rPr>
             </w:pPr>
             <w:r>
-              <w:rPr/>
+              <w:rPr>
+                <w:rFonts w:cs="Consolas" w:ascii="Consolas" w:hAnsi="Consolas"/>
+                <w:color w:val="1B1B1B"/>
+                <w:sz w:val="16"/>
+              </w:rPr>
             </w:r>
           </w:p>
           <w:p>
@@ -37831,7 +38311,11 @@
               </w:rPr>
             </w:pPr>
             <w:r>
-              <w:rPr/>
+              <w:rPr>
+                <w:rFonts w:cs="Consolas" w:ascii="Consolas" w:hAnsi="Consolas"/>
+                <w:color w:val="1B1B1B"/>
+                <w:sz w:val="16"/>
+              </w:rPr>
             </w:r>
           </w:p>
           <w:p>
@@ -37931,7 +38415,11 @@
               </w:rPr>
             </w:pPr>
             <w:r>
-              <w:rPr/>
+              <w:rPr>
+                <w:rFonts w:cs="Consolas" w:ascii="Consolas" w:hAnsi="Consolas"/>
+                <w:color w:val="1B1B1B"/>
+                <w:sz w:val="16"/>
+              </w:rPr>
             </w:r>
           </w:p>
           <w:p>
@@ -38031,7 +38519,11 @@
               </w:rPr>
             </w:pPr>
             <w:r>
-              <w:rPr/>
+              <w:rPr>
+                <w:rFonts w:cs="Consolas" w:ascii="Consolas" w:hAnsi="Consolas"/>
+                <w:color w:val="1B1B1B"/>
+                <w:sz w:val="16"/>
+              </w:rPr>
             </w:r>
           </w:p>
           <w:p>
@@ -38131,7 +38623,11 @@
               </w:rPr>
             </w:pPr>
             <w:r>
-              <w:rPr/>
+              <w:rPr>
+                <w:rFonts w:cs="Consolas" w:ascii="Consolas" w:hAnsi="Consolas"/>
+                <w:color w:val="1B1B1B"/>
+                <w:sz w:val="16"/>
+              </w:rPr>
             </w:r>
           </w:p>
           <w:p>
@@ -40322,7 +40818,7 @@
         <wp:inline distT="0" distB="0" distL="0" distR="0">
           <wp:extent cx="5760085" cy="720090"/>
           <wp:effectExtent l="0" t="0" r="0" b="0"/>
-          <wp:docPr id="3" name="Imagen3"/>
+          <wp:docPr id="3" name="Imagen4"/>
           <wp:cNvGraphicFramePr>
             <a:graphicFrameLocks xmlns:a="http://schemas.openxmlformats.org/drawingml/2006/main" noChangeAspect="1"/>
           </wp:cNvGraphicFramePr>
@@ -40330,7 +40826,7 @@
             <a:graphicData uri="http://schemas.openxmlformats.org/drawingml/2006/picture">
               <pic:pic xmlns:pic="http://schemas.openxmlformats.org/drawingml/2006/picture">
                 <pic:nvPicPr>
-                  <pic:cNvPr id="3" name="Imagen3"/>
+                  <pic:cNvPr id="3" name="Imagen4"/>
                   <pic:cNvPicPr>
                     <a:picLocks noChangeAspect="1" noChangeArrowheads="1"/>
                   </pic:cNvPicPr>
@@ -40376,7 +40872,7 @@
         <wp:inline distT="0" distB="0" distL="0" distR="0">
           <wp:extent cx="5760085" cy="720090"/>
           <wp:effectExtent l="0" t="0" r="0" b="0"/>
-          <wp:docPr id="4" name="Imagen3"/>
+          <wp:docPr id="4" name="Imagen4"/>
           <wp:cNvGraphicFramePr>
             <a:graphicFrameLocks xmlns:a="http://schemas.openxmlformats.org/drawingml/2006/main" noChangeAspect="1"/>
           </wp:cNvGraphicFramePr>
@@ -40384,7 +40880,7 @@
             <a:graphicData uri="http://schemas.openxmlformats.org/drawingml/2006/picture">
               <pic:pic xmlns:pic="http://schemas.openxmlformats.org/drawingml/2006/picture">
                 <pic:nvPicPr>
-                  <pic:cNvPr id="4" name="Imagen3"/>
+                  <pic:cNvPr id="4" name="Imagen4"/>
                   <pic:cNvPicPr>
                     <a:picLocks noChangeAspect="1" noChangeArrowheads="1"/>
                   </pic:cNvPicPr>
@@ -40600,6 +41096,7 @@
         </w:tabs>
         <w:ind w:start="1800" w:hanging="360"/>
       </w:pPr>
+      <w:rPr/>
     </w:lvl>
     <w:lvl w:ilvl="4">
       <w:start w:val="1"/>
@@ -40612,6 +41109,7 @@
         </w:tabs>
         <w:ind w:start="2160" w:hanging="360"/>
       </w:pPr>
+      <w:rPr/>
     </w:lvl>
     <w:lvl w:ilvl="5">
       <w:start w:val="1"/>
@@ -40624,6 +41122,7 @@
         </w:tabs>
         <w:ind w:start="2520" w:hanging="360"/>
       </w:pPr>
+      <w:rPr/>
     </w:lvl>
     <w:lvl w:ilvl="6">
       <w:start w:val="1"/>
@@ -40636,6 +41135,7 @@
         </w:tabs>
         <w:ind w:start="2880" w:hanging="360"/>
       </w:pPr>
+      <w:rPr/>
     </w:lvl>
     <w:lvl w:ilvl="7">
       <w:start w:val="1"/>
@@ -40648,6 +41148,7 @@
         </w:tabs>
         <w:ind w:start="3240" w:hanging="360"/>
       </w:pPr>
+      <w:rPr/>
     </w:lvl>
     <w:lvl w:ilvl="8">
       <w:start w:val="1"/>
@@ -40660,6 +41161,7 @@
         </w:tabs>
         <w:ind w:start="3600" w:hanging="360"/>
       </w:pPr>
+      <w:rPr/>
     </w:lvl>
   </w:abstractNum>
   <w:abstractNum w:abstractNumId="2">
@@ -41093,6 +41595,7 @@
     <w:qFormat/>
     <w:pPr>
       <w:widowControl/>
+      <w:suppressAutoHyphens w:val="true"/>
       <w:bidi w:val="0"/>
       <w:spacing w:lineRule="auto" w:line="276" w:before="0" w:after="120"/>
       <w:jc w:val="both"/>
@@ -41414,6 +41917,36 @@
       <w:rFonts w:cs="Arial"/>
     </w:rPr>
   </w:style>
+  <w:style w:type="paragraph" w:styleId="Ttulouser">
+    <w:name w:val="Título (user)"/>
+    <w:basedOn w:val="Normal"/>
+    <w:next w:val="BodyText"/>
+    <w:pPr>
+      <w:keepNext w:val="true"/>
+      <w:spacing w:before="240" w:after="120"/>
+    </w:pPr>
+    <w:rPr>
+      <w:rFonts w:ascii="Liberation Sans" w:hAnsi="Liberation Sans" w:eastAsia="Microsoft YaHei" w:cs="Arial"/>
+      <w:sz w:val="28"/>
+      <w:szCs w:val="28"/>
+    </w:rPr>
+  </w:style>
+  <w:style w:type="paragraph" w:styleId="ndiceuser">
+    <w:name w:val="Índice (user)"/>
+    <w:basedOn w:val="Normal"/>
+    <w:pPr>
+      <w:suppressLineNumbers/>
+    </w:pPr>
+    <w:rPr>
+      <w:rFonts w:cs="Arial"/>
+    </w:rPr>
+  </w:style>
+  <w:style w:type="paragraph" w:styleId="Cabeceraypieuser">
+    <w:name w:val="Cabecera y pie (user)"/>
+    <w:basedOn w:val="Normal"/>
+    <w:pPr/>
+    <w:rPr/>
+  </w:style>
   <w:style w:type="paragraph" w:styleId="Cabeceraypie">
     <w:name w:val="Cabecera y pie"/>
     <w:basedOn w:val="Normal"/>
@@ -41480,8 +42013,8 @@
     </w:pPr>
     <w:rPr/>
   </w:style>
-  <w:style w:type="numbering" w:styleId="Ningunalista" w:default="1">
-    <w:name w:val="Ninguna lista"/>
+  <w:style w:type="numbering" w:styleId="Ningunalistauser" w:default="1">
+    <w:name w:val="Ninguna lista (user)"/>
     <w:uiPriority w:val="99"/>
     <w:semiHidden/>
     <w:unhideWhenUsed/>

</xml_diff>